<commit_message>
chore: add project report template and ignore compiled python cache files
</commit_message>
<xml_diff>
--- a/Documentation/Project Report Index Template.docx
+++ b/Documentation/Project Report Index Template.docx
@@ -32,7 +32,7 @@
                     <pic:cNvPicPr/>
                   </pic:nvPicPr>
                   <pic:blipFill>
-                    <a:blip r:embed="rId7" cstate="print"/>
+                    <a:blip r:embed="rId8" cstate="print"/>
                     <a:stretch>
                       <a:fillRect/>
                     </a:stretch>
@@ -158,6 +158,7 @@
           <w:sz w:val="24"/>
         </w:rPr>
       </w:pPr>
+      <w:proofErr w:type="spellStart"/>
       <w:r>
         <w:rPr>
           <w:b/>
@@ -166,6 +167,7 @@
         </w:rPr>
         <w:t>Charoli</w:t>
       </w:r>
+      <w:proofErr w:type="spellEnd"/>
       <w:r>
         <w:rPr>
           <w:b/>
@@ -271,7 +273,7 @@
                     <pic:cNvPicPr/>
                   </pic:nvPicPr>
                   <pic:blipFill>
-                    <a:blip r:embed="rId8" cstate="print"/>
+                    <a:blip r:embed="rId9" cstate="print"/>
                     <a:stretch>
                       <a:fillRect/>
                     </a:stretch>
@@ -635,8 +637,47 @@
           <w:b/>
           <w:sz w:val="40"/>
         </w:rPr>
-        <w:t>Prof. Dr. Zameer S Mulla</w:t>
-      </w:r>
+        <w:t xml:space="preserve">Prof. Dr. </w:t>
+      </w:r>
+      <w:proofErr w:type="spellStart"/>
+      <w:r>
+        <w:rPr>
+          <w:b/>
+          <w:sz w:val="40"/>
+        </w:rPr>
+        <w:t>Zameer</w:t>
+      </w:r>
+      <w:proofErr w:type="spellEnd"/>
+      <w:r>
+        <w:rPr>
+          <w:b/>
+          <w:sz w:val="40"/>
+        </w:rPr>
+        <w:t xml:space="preserve"> </w:t>
+      </w:r>
+      <w:r>
+        <w:rPr>
+          <w:b/>
+          <w:sz w:val="40"/>
+        </w:rPr>
+        <w:t>A.S</w:t>
+      </w:r>
+      <w:r>
+        <w:rPr>
+          <w:b/>
+          <w:sz w:val="40"/>
+        </w:rPr>
+        <w:t xml:space="preserve"> </w:t>
+      </w:r>
+      <w:proofErr w:type="spellStart"/>
+      <w:r>
+        <w:rPr>
+          <w:b/>
+          <w:sz w:val="40"/>
+        </w:rPr>
+        <w:t>Mulla</w:t>
+      </w:r>
+      <w:proofErr w:type="spellEnd"/>
     </w:p>
     <w:p>
       <w:pPr>
@@ -658,7 +699,29 @@
         <w:rPr>
           <w:spacing w:val="-2"/>
         </w:rPr>
-        <w:t>MCA-I(Sem-</w:t>
+        <w:t>MCA-</w:t>
+      </w:r>
+      <w:proofErr w:type="gramStart"/>
+      <w:r>
+        <w:rPr>
+          <w:spacing w:val="-2"/>
+        </w:rPr>
+        <w:t>I(</w:t>
+      </w:r>
+      <w:proofErr w:type="spellStart"/>
+      <w:proofErr w:type="gramEnd"/>
+      <w:r>
+        <w:rPr>
+          <w:spacing w:val="-2"/>
+        </w:rPr>
+        <w:t>Sem</w:t>
+      </w:r>
+      <w:proofErr w:type="spellEnd"/>
+      <w:r>
+        <w:rPr>
+          <w:spacing w:val="-2"/>
+        </w:rPr>
+        <w:t>-</w:t>
       </w:r>
       <w:r>
         <w:rPr>
@@ -717,7 +780,7 @@
           <w:sz w:val="20"/>
         </w:rPr>
         <w:sectPr>
-          <w:footerReference w:type="default" r:id="rId9"/>
+          <w:footerReference w:type="default" r:id="rId10"/>
           <w:type w:val="continuous"/>
           <w:pgSz w:w="11910" w:h="16840"/>
           <w:pgMar w:top="1320" w:right="283" w:bottom="280" w:left="283" w:header="0" w:footer="283" w:gutter="0"/>
@@ -810,7 +873,7 @@
               </wp:anchor>
             </w:drawing>
           </mc:Choice>
-          <mc:Fallback xmlns:w16sdtfl="http://schemas.microsoft.com/office/word/2024/wordml/sdtformatlock" xmlns:w16sdtdh="http://schemas.microsoft.com/office/word/2020/wordml/sdtdatahash" xmlns:w16du="http://schemas.microsoft.com/office/word/2023/wordml/word16du" xmlns:w16="http://schemas.microsoft.com/office/word/2018/wordml" xmlns:w16cid="http://schemas.microsoft.com/office/word/2016/wordml/cid" xmlns:w16cex="http://schemas.microsoft.com/office/word/2018/wordml/cex" xmlns:oel="http://schemas.microsoft.com/office/2019/extlst" xmlns:am3d="http://schemas.microsoft.com/office/drawing/2017/model3d" xmlns:aink="http://schemas.microsoft.com/office/drawing/2016/ink" xmlns:cx8="http://schemas.microsoft.com/office/drawing/2016/5/14/chartex" xmlns:cx7="http://schemas.microsoft.com/office/drawing/2016/5/13/chartex" xmlns:cx6="http://schemas.microsoft.com/office/drawing/2016/5/12/chartex" xmlns:cx5="http://schemas.microsoft.com/office/drawing/2016/5/11/chartex" xmlns:cx4="http://schemas.microsoft.com/office/drawing/2016/5/10/chartex" xmlns:cx3="http://schemas.microsoft.com/office/drawing/2016/5/9/chartex" xmlns:cx2="http://schemas.microsoft.com/office/drawing/2015/10/21/chartex">
+          <mc:Fallback xmlns:cx2="http://schemas.microsoft.com/office/drawing/2015/10/21/chartex" xmlns:cx3="http://schemas.microsoft.com/office/drawing/2016/5/9/chartex" xmlns:cx4="http://schemas.microsoft.com/office/drawing/2016/5/10/chartex" xmlns:cx5="http://schemas.microsoft.com/office/drawing/2016/5/11/chartex" xmlns:cx6="http://schemas.microsoft.com/office/drawing/2016/5/12/chartex" xmlns:cx7="http://schemas.microsoft.com/office/drawing/2016/5/13/chartex" xmlns:cx8="http://schemas.microsoft.com/office/drawing/2016/5/14/chartex" xmlns:aink="http://schemas.microsoft.com/office/drawing/2016/ink" xmlns:am3d="http://schemas.microsoft.com/office/drawing/2017/model3d" xmlns:oel="http://schemas.microsoft.com/office/2019/extlst" xmlns:w16cex="http://schemas.microsoft.com/office/word/2018/wordml/cex" xmlns:w16cid="http://schemas.microsoft.com/office/word/2016/wordml/cid" xmlns:w16="http://schemas.microsoft.com/office/word/2018/wordml" xmlns:w16du="http://schemas.microsoft.com/office/word/2023/wordml/word16du" xmlns:w16sdtdh="http://schemas.microsoft.com/office/word/2020/wordml/sdtdatahash" xmlns:w16sdtfl="http://schemas.microsoft.com/office/word/2024/wordml/sdtformatlock">
             <w:pict>
               <v:shape w14:anchorId="3BFA4045" id="Graphic 3" o:spid="_x0000_s1026" style="position:absolute;margin-left:41.15pt;margin-top:16.2pt;width:513.25pt;height:.5pt;z-index:-15728128;visibility:visible;mso-wrap-style:square;mso-wrap-distance-left:0;mso-wrap-distance-top:0;mso-wrap-distance-right:0;mso-wrap-distance-bottom:0;mso-position-horizontal:absolute;mso-position-horizontal-relative:page;mso-position-vertical:absolute;mso-position-vertical-relative:text;v-text-anchor:top" coordsize="6518275,6350" o:gfxdata="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" path="m6517894,l,,,6095r6517894,l6517894,xe" fillcolor="#d9d9d9" stroked="f">
                 <v:path arrowok="t"/>
@@ -1040,7 +1103,7 @@
                     <pic:cNvPicPr/>
                   </pic:nvPicPr>
                   <pic:blipFill>
-                    <a:blip r:embed="rId10" cstate="print"/>
+                    <a:blip r:embed="rId11" cstate="print"/>
                     <a:stretch>
                       <a:fillRect/>
                     </a:stretch>
@@ -1186,6 +1249,7 @@
         </w:rPr>
         <w:t xml:space="preserve">  </w:t>
       </w:r>
+      <w:proofErr w:type="spellStart"/>
       <w:r>
         <w:rPr>
           <w:b/>
@@ -1193,6 +1257,7 @@
         </w:rPr>
         <w:t>Dr</w:t>
       </w:r>
+      <w:proofErr w:type="spellEnd"/>
       <w:r>
         <w:rPr>
           <w:b/>
@@ -1382,7 +1447,29 @@
           <w:sz w:val="28"/>
           <w:u w:val="single"/>
         </w:rPr>
-        <w:t>Blog Platform With CMS</w:t>
+        <w:t xml:space="preserve">Blog Platform </w:t>
+      </w:r>
+      <w:proofErr w:type="gramStart"/>
+      <w:r>
+        <w:rPr>
+          <w:b/>
+          <w:bCs/>
+          <w:spacing w:val="-14"/>
+          <w:sz w:val="28"/>
+          <w:u w:val="single"/>
+        </w:rPr>
+        <w:t>With</w:t>
+      </w:r>
+      <w:proofErr w:type="gramEnd"/>
+      <w:r>
+        <w:rPr>
+          <w:b/>
+          <w:bCs/>
+          <w:spacing w:val="-14"/>
+          <w:sz w:val="28"/>
+          <w:u w:val="single"/>
+        </w:rPr>
+        <w:t xml:space="preserve"> CMS</w:t>
       </w:r>
       <w:r>
         <w:rPr>
@@ -1543,23 +1630,81 @@
           <w:b/>
           <w:sz w:val="28"/>
         </w:rPr>
-        <w:t>Prof. Dr. Zameer S Mulla</w:t>
-      </w:r>
+        <w:t xml:space="preserve">Prof. Dr. </w:t>
+      </w:r>
+      <w:proofErr w:type="spellStart"/>
       <w:r>
         <w:rPr>
           <w:b/>
           <w:sz w:val="28"/>
         </w:rPr>
+        <w:t>Zameer</w:t>
+      </w:r>
+      <w:proofErr w:type="spellEnd"/>
+      <w:r>
+        <w:rPr>
+          <w:b/>
+          <w:sz w:val="28"/>
+        </w:rPr>
+        <w:t xml:space="preserve"> A.S</w:t>
+      </w:r>
+      <w:r>
+        <w:rPr>
+          <w:b/>
+          <w:sz w:val="28"/>
+        </w:rPr>
+        <w:t xml:space="preserve"> </w:t>
+      </w:r>
+      <w:proofErr w:type="spellStart"/>
+      <w:r>
+        <w:rPr>
+          <w:b/>
+          <w:sz w:val="28"/>
+        </w:rPr>
+        <w:t>Mulla</w:t>
+      </w:r>
+      <w:proofErr w:type="spellEnd"/>
+      <w:r>
+        <w:rPr>
+          <w:b/>
+          <w:sz w:val="28"/>
+        </w:rPr>
         <w:tab/>
-        <w:t>Prof. Sapna Chavan</w:t>
-      </w:r>
+        <w:t xml:space="preserve">Prof. </w:t>
+      </w:r>
+      <w:proofErr w:type="spellStart"/>
       <w:r>
         <w:rPr>
           <w:b/>
           <w:sz w:val="28"/>
         </w:rPr>
+        <w:t>Sapna</w:t>
+      </w:r>
+      <w:proofErr w:type="spellEnd"/>
+      <w:r>
+        <w:rPr>
+          <w:b/>
+          <w:sz w:val="28"/>
+        </w:rPr>
+        <w:t xml:space="preserve"> </w:t>
+      </w:r>
+      <w:proofErr w:type="spellStart"/>
+      <w:r>
+        <w:rPr>
+          <w:b/>
+          <w:sz w:val="28"/>
+        </w:rPr>
+        <w:t>Chavan</w:t>
+      </w:r>
+      <w:proofErr w:type="spellEnd"/>
+      <w:r>
+        <w:rPr>
+          <w:b/>
+          <w:sz w:val="28"/>
+        </w:rPr>
         <w:tab/>
       </w:r>
+      <w:proofErr w:type="spellStart"/>
       <w:r>
         <w:rPr>
           <w:b/>
@@ -1568,6 +1713,7 @@
         </w:rPr>
         <w:t>Dr</w:t>
       </w:r>
+      <w:proofErr w:type="spellEnd"/>
       <w:r>
         <w:rPr>
           <w:b/>
@@ -1608,13 +1754,23 @@
         </w:rPr>
         <w:t xml:space="preserve"> </w:t>
       </w:r>
+      <w:proofErr w:type="spellStart"/>
       <w:r>
         <w:rPr>
           <w:b/>
           <w:spacing w:val="-2"/>
           <w:sz w:val="28"/>
         </w:rPr>
-        <w:t xml:space="preserve">Khedkar </w:t>
+        <w:t>Khedkar</w:t>
+      </w:r>
+      <w:proofErr w:type="spellEnd"/>
+      <w:r>
+        <w:rPr>
+          <w:b/>
+          <w:spacing w:val="-2"/>
+          <w:sz w:val="28"/>
+        </w:rPr>
+        <w:t xml:space="preserve"> </w:t>
       </w:r>
       <w:r>
         <w:rPr>
@@ -1888,7 +2044,7 @@
               </wp:anchor>
             </w:drawing>
           </mc:Choice>
-          <mc:Fallback xmlns:w16sdtfl="http://schemas.microsoft.com/office/word/2024/wordml/sdtformatlock" xmlns:w16sdtdh="http://schemas.microsoft.com/office/word/2020/wordml/sdtdatahash" xmlns:w16du="http://schemas.microsoft.com/office/word/2023/wordml/word16du" xmlns:w16="http://schemas.microsoft.com/office/word/2018/wordml" xmlns:w16cid="http://schemas.microsoft.com/office/word/2016/wordml/cid" xmlns:w16cex="http://schemas.microsoft.com/office/word/2018/wordml/cex" xmlns:oel="http://schemas.microsoft.com/office/2019/extlst" xmlns:am3d="http://schemas.microsoft.com/office/drawing/2017/model3d" xmlns:aink="http://schemas.microsoft.com/office/drawing/2016/ink" xmlns:cx8="http://schemas.microsoft.com/office/drawing/2016/5/14/chartex" xmlns:cx7="http://schemas.microsoft.com/office/drawing/2016/5/13/chartex" xmlns:cx6="http://schemas.microsoft.com/office/drawing/2016/5/12/chartex" xmlns:cx5="http://schemas.microsoft.com/office/drawing/2016/5/11/chartex" xmlns:cx4="http://schemas.microsoft.com/office/drawing/2016/5/10/chartex" xmlns:cx3="http://schemas.microsoft.com/office/drawing/2016/5/9/chartex" xmlns:cx2="http://schemas.microsoft.com/office/drawing/2015/10/21/chartex">
+          <mc:Fallback xmlns:cx2="http://schemas.microsoft.com/office/drawing/2015/10/21/chartex" xmlns:cx3="http://schemas.microsoft.com/office/drawing/2016/5/9/chartex" xmlns:cx4="http://schemas.microsoft.com/office/drawing/2016/5/10/chartex" xmlns:cx5="http://schemas.microsoft.com/office/drawing/2016/5/11/chartex" xmlns:cx6="http://schemas.microsoft.com/office/drawing/2016/5/12/chartex" xmlns:cx7="http://schemas.microsoft.com/office/drawing/2016/5/13/chartex" xmlns:cx8="http://schemas.microsoft.com/office/drawing/2016/5/14/chartex" xmlns:aink="http://schemas.microsoft.com/office/drawing/2016/ink" xmlns:am3d="http://schemas.microsoft.com/office/drawing/2017/model3d" xmlns:oel="http://schemas.microsoft.com/office/2019/extlst" xmlns:w16cex="http://schemas.microsoft.com/office/word/2018/wordml/cex" xmlns:w16cid="http://schemas.microsoft.com/office/word/2016/wordml/cid" xmlns:w16="http://schemas.microsoft.com/office/word/2018/wordml" xmlns:w16du="http://schemas.microsoft.com/office/word/2023/wordml/word16du" xmlns:w16sdtdh="http://schemas.microsoft.com/office/word/2020/wordml/sdtdatahash" xmlns:w16sdtfl="http://schemas.microsoft.com/office/word/2024/wordml/sdtformatlock">
             <w:pict>
               <v:shape w14:anchorId="4D6DE837" id="Graphic 7" o:spid="_x0000_s1026" style="position:absolute;margin-left:41.15pt;margin-top:19.7pt;width:513.25pt;height:.5pt;z-index:-15727104;visibility:visible;mso-wrap-style:square;mso-wrap-distance-left:0;mso-wrap-distance-top:0;mso-wrap-distance-right:0;mso-wrap-distance-bottom:0;mso-position-horizontal:absolute;mso-position-horizontal-relative:page;mso-position-vertical:absolute;mso-position-vertical-relative:text;v-text-anchor:top" coordsize="6518275,6350" o:gfxdata="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" path="m6517894,l,,,6095r6517894,l6517894,xe" fillcolor="#d9d9d9" stroked="f">
                 <v:path arrowok="t"/>
@@ -2125,7 +2281,21 @@
         <w:rPr>
           <w:b/>
         </w:rPr>
-        <w:t xml:space="preserve">Dr. E. B. Khedkar </w:t>
+        <w:t xml:space="preserve">Dr. E. B. </w:t>
+      </w:r>
+      <w:proofErr w:type="spellStart"/>
+      <w:r>
+        <w:rPr>
+          <w:b/>
+        </w:rPr>
+        <w:t>Khedkar</w:t>
+      </w:r>
+      <w:proofErr w:type="spellEnd"/>
+      <w:r>
+        <w:rPr>
+          <w:b/>
+        </w:rPr>
+        <w:t xml:space="preserve"> </w:t>
       </w:r>
       <w:r>
         <w:t xml:space="preserve">and </w:t>
@@ -2134,14 +2304,30 @@
         <w:rPr>
           <w:b/>
         </w:rPr>
-        <w:t xml:space="preserve">Prof. Sapna </w:t>
-      </w:r>
+        <w:t xml:space="preserve">Prof. </w:t>
+      </w:r>
+      <w:proofErr w:type="spellStart"/>
+      <w:r>
+        <w:rPr>
+          <w:b/>
+        </w:rPr>
+        <w:t>Sapna</w:t>
+      </w:r>
+      <w:proofErr w:type="spellEnd"/>
+      <w:r>
+        <w:rPr>
+          <w:b/>
+        </w:rPr>
+        <w:t xml:space="preserve"> </w:t>
+      </w:r>
+      <w:proofErr w:type="spellStart"/>
       <w:r>
         <w:rPr>
           <w:b/>
         </w:rPr>
         <w:t>Chavan</w:t>
       </w:r>
+      <w:proofErr w:type="spellEnd"/>
       <w:r>
         <w:t>–HOD and other teaching and non- teaching staff for their useful guidance during the completion of this project report.</w:t>
       </w:r>
@@ -2171,8 +2357,36 @@
         <w:rPr>
           <w:b/>
         </w:rPr>
-        <w:t>Prof. Dr. Zameer S Mulla</w:t>
-      </w:r>
+        <w:t xml:space="preserve">Prof. Dr. </w:t>
+      </w:r>
+      <w:proofErr w:type="spellStart"/>
+      <w:r>
+        <w:rPr>
+          <w:b/>
+        </w:rPr>
+        <w:t>Zameer</w:t>
+      </w:r>
+      <w:proofErr w:type="spellEnd"/>
+      <w:r>
+        <w:rPr>
+          <w:b/>
+        </w:rPr>
+        <w:t xml:space="preserve"> A.S</w:t>
+      </w:r>
+      <w:r>
+        <w:rPr>
+          <w:b/>
+        </w:rPr>
+        <w:t xml:space="preserve"> </w:t>
+      </w:r>
+      <w:proofErr w:type="spellStart"/>
+      <w:r>
+        <w:rPr>
+          <w:b/>
+        </w:rPr>
+        <w:t>Mulla</w:t>
+      </w:r>
+      <w:proofErr w:type="spellEnd"/>
       <w:r>
         <w:rPr>
           <w:b/>
@@ -2582,7 +2796,29 @@
         <w:rPr>
           <w:sz w:val="28"/>
         </w:rPr>
-        <w:t>(Sem-I)</w:t>
+        <w:t>(</w:t>
+      </w:r>
+      <w:proofErr w:type="spellStart"/>
+      <w:proofErr w:type="gramStart"/>
+      <w:r>
+        <w:rPr>
+          <w:sz w:val="28"/>
+        </w:rPr>
+        <w:t>Sem</w:t>
+      </w:r>
+      <w:proofErr w:type="spellEnd"/>
+      <w:r>
+        <w:rPr>
+          <w:sz w:val="28"/>
+        </w:rPr>
+        <w:t>-</w:t>
+      </w:r>
+      <w:proofErr w:type="gramEnd"/>
+      <w:r>
+        <w:rPr>
+          <w:sz w:val="28"/>
+        </w:rPr>
+        <w:t>I)</w:t>
       </w:r>
     </w:p>
     <w:p>
@@ -2593,12 +2829,14 @@
           <w:sz w:val="28"/>
         </w:rPr>
       </w:pPr>
+      <w:proofErr w:type="spellStart"/>
       <w:r>
         <w:rPr>
           <w:sz w:val="28"/>
         </w:rPr>
         <w:t>Dr</w:t>
       </w:r>
+      <w:proofErr w:type="spellEnd"/>
       <w:r>
         <w:rPr>
           <w:spacing w:val="-2"/>
@@ -2927,6 +3165,12 @@
                 <w:sz w:val="28"/>
               </w:rPr>
             </w:pPr>
+            <w:r>
+              <w:rPr>
+                <w:sz w:val="28"/>
+              </w:rPr>
+              <w:t>5-6</w:t>
+            </w:r>
           </w:p>
         </w:tc>
       </w:tr>
@@ -2992,6 +3236,12 @@
                 <w:sz w:val="28"/>
               </w:rPr>
             </w:pPr>
+            <w:r>
+              <w:rPr>
+                <w:sz w:val="28"/>
+              </w:rPr>
+              <w:t>5</w:t>
+            </w:r>
           </w:p>
         </w:tc>
       </w:tr>
@@ -3122,6 +3372,12 @@
                 <w:sz w:val="28"/>
               </w:rPr>
             </w:pPr>
+            <w:r>
+              <w:rPr>
+                <w:sz w:val="28"/>
+              </w:rPr>
+              <w:t>5</w:t>
+            </w:r>
           </w:p>
         </w:tc>
       </w:tr>
@@ -3213,6 +3469,12 @@
                 <w:sz w:val="28"/>
               </w:rPr>
             </w:pPr>
+            <w:r>
+              <w:rPr>
+                <w:sz w:val="28"/>
+              </w:rPr>
+              <w:t>5</w:t>
+            </w:r>
           </w:p>
         </w:tc>
       </w:tr>
@@ -3412,6 +3674,12 @@
                 <w:sz w:val="28"/>
               </w:rPr>
             </w:pPr>
+            <w:r>
+              <w:rPr>
+                <w:sz w:val="28"/>
+              </w:rPr>
+              <w:t>6</w:t>
+            </w:r>
           </w:p>
         </w:tc>
       </w:tr>
@@ -3575,12 +3843,14 @@
                 <w:sz w:val="28"/>
               </w:rPr>
             </w:pPr>
+            <w:proofErr w:type="gramStart"/>
             <w:r>
               <w:rPr>
                 <w:sz w:val="28"/>
               </w:rPr>
               <w:t>to</w:t>
             </w:r>
+            <w:proofErr w:type="gramEnd"/>
             <w:r>
               <w:rPr>
                 <w:spacing w:val="-10"/>
@@ -3663,6 +3933,12 @@
                 <w:sz w:val="28"/>
               </w:rPr>
             </w:pPr>
+            <w:r>
+              <w:rPr>
+                <w:sz w:val="28"/>
+              </w:rPr>
+              <w:t>6</w:t>
+            </w:r>
           </w:p>
         </w:tc>
       </w:tr>
@@ -3793,6 +4069,12 @@
                 <w:sz w:val="28"/>
               </w:rPr>
             </w:pPr>
+            <w:r>
+              <w:rPr>
+                <w:sz w:val="28"/>
+              </w:rPr>
+              <w:t>6</w:t>
+            </w:r>
           </w:p>
         </w:tc>
       </w:tr>
@@ -3908,6 +4190,12 @@
                 <w:sz w:val="28"/>
               </w:rPr>
             </w:pPr>
+            <w:r>
+              <w:rPr>
+                <w:sz w:val="28"/>
+              </w:rPr>
+              <w:t>6-9</w:t>
+            </w:r>
           </w:p>
         </w:tc>
       </w:tr>
@@ -3986,6 +4274,12 @@
                 <w:sz w:val="28"/>
               </w:rPr>
             </w:pPr>
+            <w:r>
+              <w:rPr>
+                <w:sz w:val="28"/>
+              </w:rPr>
+              <w:t>6</w:t>
+            </w:r>
           </w:p>
         </w:tc>
       </w:tr>
@@ -4090,6 +4384,12 @@
                 <w:sz w:val="28"/>
               </w:rPr>
             </w:pPr>
+            <w:r>
+              <w:rPr>
+                <w:sz w:val="28"/>
+              </w:rPr>
+              <w:t>7-9</w:t>
+            </w:r>
           </w:p>
         </w:tc>
       </w:tr>
@@ -4311,6 +4611,12 @@
                 <w:sz w:val="28"/>
               </w:rPr>
             </w:pPr>
+            <w:r>
+              <w:rPr>
+                <w:sz w:val="28"/>
+              </w:rPr>
+              <w:t>10-20</w:t>
+            </w:r>
           </w:p>
         </w:tc>
       </w:tr>
@@ -4441,6 +4747,12 @@
                 <w:sz w:val="28"/>
               </w:rPr>
             </w:pPr>
+            <w:r>
+              <w:rPr>
+                <w:sz w:val="28"/>
+              </w:rPr>
+              <w:t>10</w:t>
+            </w:r>
           </w:p>
         </w:tc>
       </w:tr>
@@ -4545,6 +4857,12 @@
                 <w:sz w:val="28"/>
               </w:rPr>
             </w:pPr>
+            <w:r>
+              <w:rPr>
+                <w:sz w:val="28"/>
+              </w:rPr>
+              <w:t>11</w:t>
+            </w:r>
           </w:p>
         </w:tc>
       </w:tr>
@@ -4623,6 +4941,12 @@
                 <w:sz w:val="28"/>
               </w:rPr>
             </w:pPr>
+            <w:r>
+              <w:rPr>
+                <w:sz w:val="28"/>
+              </w:rPr>
+              <w:t>12</w:t>
+            </w:r>
           </w:p>
         </w:tc>
       </w:tr>
@@ -4714,6 +5038,12 @@
                 <w:sz w:val="28"/>
               </w:rPr>
             </w:pPr>
+            <w:r>
+              <w:rPr>
+                <w:sz w:val="28"/>
+              </w:rPr>
+              <w:t>13</w:t>
+            </w:r>
           </w:p>
         </w:tc>
       </w:tr>
@@ -4792,6 +5122,12 @@
                 <w:sz w:val="28"/>
               </w:rPr>
             </w:pPr>
+            <w:r>
+              <w:rPr>
+                <w:sz w:val="28"/>
+              </w:rPr>
+              <w:t>14</w:t>
+            </w:r>
           </w:p>
         </w:tc>
       </w:tr>
@@ -4870,6 +5206,12 @@
                 <w:sz w:val="28"/>
               </w:rPr>
             </w:pPr>
+            <w:r>
+              <w:rPr>
+                <w:sz w:val="28"/>
+              </w:rPr>
+              <w:t>15</w:t>
+            </w:r>
           </w:p>
         </w:tc>
       </w:tr>
@@ -4948,6 +5290,12 @@
                 <w:sz w:val="28"/>
               </w:rPr>
             </w:pPr>
+            <w:r>
+              <w:rPr>
+                <w:sz w:val="28"/>
+              </w:rPr>
+              <w:t>16</w:t>
+            </w:r>
           </w:p>
         </w:tc>
       </w:tr>
@@ -5059,6 +5407,12 @@
                 <w:sz w:val="28"/>
               </w:rPr>
             </w:pPr>
+            <w:r>
+              <w:rPr>
+                <w:sz w:val="28"/>
+              </w:rPr>
+              <w:t>17</w:t>
+            </w:r>
           </w:p>
         </w:tc>
       </w:tr>
@@ -5176,6 +5530,12 @@
                 <w:sz w:val="28"/>
               </w:rPr>
             </w:pPr>
+            <w:r>
+              <w:rPr>
+                <w:sz w:val="28"/>
+              </w:rPr>
+              <w:t>18-20</w:t>
+            </w:r>
           </w:p>
         </w:tc>
       </w:tr>
@@ -5245,6 +5605,12 @@
                 <w:sz w:val="28"/>
               </w:rPr>
             </w:pPr>
+            <w:r>
+              <w:rPr>
+                <w:sz w:val="28"/>
+              </w:rPr>
+              <w:t>21-25</w:t>
+            </w:r>
           </w:p>
         </w:tc>
       </w:tr>
@@ -5310,12 +5676,18 @@
                 <w:sz w:val="28"/>
               </w:rPr>
             </w:pPr>
+            <w:r>
+              <w:rPr>
+                <w:sz w:val="28"/>
+              </w:rPr>
+              <w:t>21-23</w:t>
+            </w:r>
           </w:p>
         </w:tc>
       </w:tr>
       <w:tr>
         <w:trPr>
-          <w:trHeight w:val="277"/>
+          <w:trHeight w:val="465"/>
         </w:trPr>
         <w:tc>
           <w:tcPr>
@@ -5388,6 +5760,12 @@
                 <w:sz w:val="28"/>
               </w:rPr>
             </w:pPr>
+            <w:r>
+              <w:rPr>
+                <w:sz w:val="28"/>
+              </w:rPr>
+              <w:t>24-25</w:t>
+            </w:r>
           </w:p>
         </w:tc>
       </w:tr>
@@ -5452,11 +5830,16 @@
               <w:pStyle w:val="TableParagraph"/>
               <w:spacing w:before="2" w:line="240" w:lineRule="auto"/>
               <w:ind w:left="15" w:right="1"/>
-              <w:jc w:val="center"/>
               <w:rPr>
                 <w:sz w:val="28"/>
               </w:rPr>
             </w:pPr>
+            <w:r>
+              <w:rPr>
+                <w:sz w:val="28"/>
+              </w:rPr>
+              <w:t xml:space="preserve">     26-27</w:t>
+            </w:r>
           </w:p>
         </w:tc>
       </w:tr>
@@ -5528,6 +5911,12 @@
                 <w:sz w:val="28"/>
               </w:rPr>
             </w:pPr>
+            <w:r>
+              <w:rPr>
+                <w:sz w:val="28"/>
+              </w:rPr>
+              <w:t>26</w:t>
+            </w:r>
           </w:p>
         </w:tc>
       </w:tr>
@@ -5619,6 +6008,12 @@
                 <w:sz w:val="28"/>
               </w:rPr>
             </w:pPr>
+            <w:r>
+              <w:rPr>
+                <w:sz w:val="28"/>
+              </w:rPr>
+              <w:t>26</w:t>
+            </w:r>
           </w:p>
         </w:tc>
       </w:tr>
@@ -5710,6 +6105,12 @@
                 <w:sz w:val="28"/>
               </w:rPr>
             </w:pPr>
+            <w:r>
+              <w:rPr>
+                <w:sz w:val="28"/>
+              </w:rPr>
+              <w:t>27</w:t>
+            </w:r>
           </w:p>
         </w:tc>
       </w:tr>
@@ -5827,6 +6228,12 @@
                 <w:sz w:val="28"/>
               </w:rPr>
             </w:pPr>
+            <w:r>
+              <w:rPr>
+                <w:sz w:val="28"/>
+              </w:rPr>
+              <w:t>27</w:t>
+            </w:r>
           </w:p>
         </w:tc>
       </w:tr>
@@ -5918,6 +6325,12 @@
                 <w:sz w:val="28"/>
               </w:rPr>
             </w:pPr>
+            <w:r>
+              <w:rPr>
+                <w:sz w:val="28"/>
+              </w:rPr>
+              <w:t>27</w:t>
+            </w:r>
           </w:p>
         </w:tc>
       </w:tr>
@@ -6032,6 +6445,12 @@
                 <w:sz w:val="28"/>
               </w:rPr>
             </w:pPr>
+            <w:r>
+              <w:rPr>
+                <w:sz w:val="28"/>
+              </w:rPr>
+              <w:t>28</w:t>
+            </w:r>
           </w:p>
         </w:tc>
       </w:tr>
@@ -6116,6 +6535,12 @@
                 <w:sz w:val="28"/>
               </w:rPr>
             </w:pPr>
+            <w:r>
+              <w:rPr>
+                <w:sz w:val="28"/>
+              </w:rPr>
+              <w:t>29</w:t>
+            </w:r>
           </w:p>
         </w:tc>
       </w:tr>
@@ -6185,6 +6610,12 @@
                 <w:sz w:val="28"/>
               </w:rPr>
             </w:pPr>
+            <w:r>
+              <w:rPr>
+                <w:sz w:val="28"/>
+              </w:rPr>
+              <w:t>29</w:t>
+            </w:r>
           </w:p>
         </w:tc>
       </w:tr>
@@ -6254,6 +6685,12 @@
                 <w:sz w:val="28"/>
               </w:rPr>
             </w:pPr>
+            <w:r>
+              <w:rPr>
+                <w:sz w:val="28"/>
+              </w:rPr>
+              <w:t>30</w:t>
+            </w:r>
           </w:p>
         </w:tc>
       </w:tr>
@@ -6636,23 +7073,22 @@
           <w:szCs w:val="24"/>
         </w:rPr>
       </w:pPr>
-      <w:r>
-        <w:rPr>
-          <w:sz w:val="24"/>
-          <w:szCs w:val="24"/>
-        </w:rPr>
-        <w:t>phase.</w:t>
-      </w:r>
-    </w:p>
-    <w:p>
-      <w:pPr>
-        <w:spacing w:before="100" w:beforeAutospacing="1" w:after="100" w:afterAutospacing="1" w:line="360" w:lineRule="auto"/>
-        <w:ind w:left="720"/>
-        <w:rPr>
-          <w:sz w:val="24"/>
-          <w:szCs w:val="24"/>
-        </w:rPr>
-      </w:pPr>
+      <w:proofErr w:type="gramStart"/>
+      <w:r>
+        <w:rPr>
+          <w:sz w:val="24"/>
+          <w:szCs w:val="24"/>
+        </w:rPr>
+        <w:t>phase</w:t>
+      </w:r>
+      <w:proofErr w:type="gramEnd"/>
+      <w:r>
+        <w:rPr>
+          <w:sz w:val="24"/>
+          <w:szCs w:val="24"/>
+        </w:rPr>
+        <w:t>.</w:t>
+      </w:r>
     </w:p>
     <w:p>
       <w:pPr>
@@ -6788,7 +7224,6 @@
           <w:sz w:val="24"/>
           <w:szCs w:val="24"/>
         </w:rPr>
-        <w:lastRenderedPageBreak/>
         <w:t>Operating System:</w:t>
       </w:r>
       <w:r>
@@ -6796,7 +7231,23 @@
           <w:sz w:val="24"/>
           <w:szCs w:val="24"/>
         </w:rPr>
-        <w:t xml:space="preserve"> Platform-independent (Windows, macOS, Linux/Unix) as the</w:t>
+        <w:t xml:space="preserve"> Platform-independent (Windows, </w:t>
+      </w:r>
+      <w:proofErr w:type="spellStart"/>
+      <w:r>
+        <w:rPr>
+          <w:sz w:val="24"/>
+          <w:szCs w:val="24"/>
+        </w:rPr>
+        <w:t>macOS</w:t>
+      </w:r>
+      <w:proofErr w:type="spellEnd"/>
+      <w:r>
+        <w:rPr>
+          <w:sz w:val="24"/>
+          <w:szCs w:val="24"/>
+        </w:rPr>
+        <w:t>, Linux/Unix) as the</w:t>
       </w:r>
       <w:r>
         <w:rPr>
@@ -6840,6 +7291,7 @@
           <w:sz w:val="24"/>
           <w:szCs w:val="24"/>
         </w:rPr>
+        <w:lastRenderedPageBreak/>
         <w:t>Frontend:</w:t>
       </w:r>
       <w:r>
@@ -7006,7 +7458,15 @@
           <w:sz w:val="24"/>
           <w:szCs w:val="24"/>
         </w:rPr>
-        <w:t xml:space="preserve"> A React-based framework enabling server-side rendering and static site generation to </w:t>
+        <w:t xml:space="preserve"> A React-based framework enabling server-side rendering and static site generation </w:t>
+      </w:r>
+      <w:proofErr w:type="gramStart"/>
+      <w:r>
+        <w:rPr>
+          <w:sz w:val="24"/>
+          <w:szCs w:val="24"/>
+        </w:rPr>
+        <w:t xml:space="preserve">to </w:t>
       </w:r>
       <w:r>
         <w:rPr>
@@ -7020,7 +7480,15 @@
           <w:sz w:val="24"/>
           <w:szCs w:val="24"/>
         </w:rPr>
-        <w:t>enhance SEO and performance.</w:t>
+        <w:t>enhance</w:t>
+      </w:r>
+      <w:proofErr w:type="gramEnd"/>
+      <w:r>
+        <w:rPr>
+          <w:sz w:val="24"/>
+          <w:szCs w:val="24"/>
+        </w:rPr>
+        <w:t xml:space="preserve"> SEO and performance.</w:t>
       </w:r>
     </w:p>
     <w:p>
@@ -7126,6 +7594,7 @@
           <w:szCs w:val="24"/>
         </w:rPr>
       </w:pPr>
+      <w:proofErr w:type="spellStart"/>
       <w:r>
         <w:rPr>
           <w:b/>
@@ -7135,6 +7604,7 @@
         </w:rPr>
         <w:t>PyMongo</w:t>
       </w:r>
+      <w:proofErr w:type="spellEnd"/>
       <w:r>
         <w:rPr>
           <w:b/>
@@ -7255,7 +7725,23 @@
           <w:sz w:val="24"/>
           <w:szCs w:val="24"/>
         </w:rPr>
-        <w:t xml:space="preserve">Popular blogging platforms such as WordPress and Medium offer extensive features but often come with heavy dependencies, limited customization, or proprietary restrictions. This system leverages modern frameworks like Next.js and Python-based backends with MongoDB to deliver a dynamic, </w:t>
+        <w:t xml:space="preserve">Popular blogging platforms such as WordPress and Medium offer extensive features but often come with heavy dependencies, limited customization, or proprietary restrictions. This system leverages modern frameworks like Next.js and Python-based </w:t>
+      </w:r>
+      <w:proofErr w:type="spellStart"/>
+      <w:r>
+        <w:rPr>
+          <w:sz w:val="24"/>
+          <w:szCs w:val="24"/>
+        </w:rPr>
+        <w:t>backends</w:t>
+      </w:r>
+      <w:proofErr w:type="spellEnd"/>
+      <w:r>
+        <w:rPr>
+          <w:sz w:val="24"/>
+          <w:szCs w:val="24"/>
+        </w:rPr>
+        <w:t xml:space="preserve"> with MongoDB to deliver a dynamic, </w:t>
       </w:r>
       <w:r>
         <w:rPr>
@@ -7471,6 +7957,7 @@
           <w:sz w:val="28"/>
           <w:szCs w:val="28"/>
         </w:rPr>
+        <w:lastRenderedPageBreak/>
         <w:t xml:space="preserve">2.2 </w:t>
       </w:r>
       <w:r>
@@ -7670,8 +8157,19 @@
           <w:sz w:val="24"/>
           <w:szCs w:val="24"/>
         </w:rPr>
-        <w:t>User Authentication Module:</w:t>
-      </w:r>
+        <w:t>User Authentication Module</w:t>
+      </w:r>
+      <w:proofErr w:type="gramStart"/>
+      <w:r>
+        <w:rPr>
+          <w:b/>
+          <w:bCs/>
+          <w:sz w:val="24"/>
+          <w:szCs w:val="24"/>
+        </w:rPr>
+        <w:t>:</w:t>
+      </w:r>
+      <w:proofErr w:type="gramEnd"/>
       <w:r>
         <w:rPr>
           <w:sz w:val="24"/>
@@ -7708,8 +8206,19 @@
           <w:sz w:val="24"/>
           <w:szCs w:val="24"/>
         </w:rPr>
-        <w:t>Post Management Module:</w:t>
-      </w:r>
+        <w:t>Post Management Module</w:t>
+      </w:r>
+      <w:proofErr w:type="gramStart"/>
+      <w:r>
+        <w:rPr>
+          <w:b/>
+          <w:bCs/>
+          <w:sz w:val="24"/>
+          <w:szCs w:val="24"/>
+        </w:rPr>
+        <w:t>:</w:t>
+      </w:r>
+      <w:proofErr w:type="gramEnd"/>
       <w:r>
         <w:rPr>
           <w:sz w:val="24"/>
@@ -7746,8 +8255,19 @@
           <w:sz w:val="24"/>
           <w:szCs w:val="24"/>
         </w:rPr>
-        <w:t>Markdown Rendering Module:</w:t>
-      </w:r>
+        <w:t>Markdown Rendering Module</w:t>
+      </w:r>
+      <w:proofErr w:type="gramStart"/>
+      <w:r>
+        <w:rPr>
+          <w:b/>
+          <w:bCs/>
+          <w:sz w:val="24"/>
+          <w:szCs w:val="24"/>
+        </w:rPr>
+        <w:t>:</w:t>
+      </w:r>
+      <w:proofErr w:type="gramEnd"/>
       <w:r>
         <w:rPr>
           <w:sz w:val="24"/>
@@ -7784,8 +8304,19 @@
           <w:sz w:val="24"/>
           <w:szCs w:val="24"/>
         </w:rPr>
-        <w:t>Commenting Module:</w:t>
-      </w:r>
+        <w:t>Commenting Module</w:t>
+      </w:r>
+      <w:proofErr w:type="gramStart"/>
+      <w:r>
+        <w:rPr>
+          <w:b/>
+          <w:bCs/>
+          <w:sz w:val="24"/>
+          <w:szCs w:val="24"/>
+        </w:rPr>
+        <w:t>:</w:t>
+      </w:r>
+      <w:proofErr w:type="gramEnd"/>
       <w:r>
         <w:rPr>
           <w:sz w:val="24"/>
@@ -7822,8 +8353,19 @@
           <w:sz w:val="24"/>
           <w:szCs w:val="24"/>
         </w:rPr>
-        <w:t>Frontend UI Module:</w:t>
-      </w:r>
+        <w:t>Frontend UI Module</w:t>
+      </w:r>
+      <w:proofErr w:type="gramStart"/>
+      <w:r>
+        <w:rPr>
+          <w:b/>
+          <w:bCs/>
+          <w:sz w:val="24"/>
+          <w:szCs w:val="24"/>
+        </w:rPr>
+        <w:t>:</w:t>
+      </w:r>
+      <w:proofErr w:type="gramEnd"/>
       <w:r>
         <w:rPr>
           <w:sz w:val="24"/>
@@ -7975,7 +8517,6 @@
           <w:sz w:val="28"/>
           <w:szCs w:val="28"/>
         </w:rPr>
-        <w:lastRenderedPageBreak/>
         <w:t xml:space="preserve">3.1 </w:t>
       </w:r>
       <w:r>
@@ -8005,6 +8546,7 @@
           <w:sz w:val="24"/>
           <w:szCs w:val="24"/>
         </w:rPr>
+        <w:lastRenderedPageBreak/>
         <w:t>System requirements define what the system should do and how well it should perform.</w:t>
       </w:r>
     </w:p>
@@ -8351,7 +8893,6 @@
           <w:b/>
           <w:bCs/>
         </w:rPr>
-        <w:lastRenderedPageBreak/>
         <w:t>FR7: View Blog Posts</w:t>
       </w:r>
     </w:p>
@@ -8365,6 +8906,7 @@
         <w:spacing w:line="360" w:lineRule="auto"/>
       </w:pPr>
       <w:r>
+        <w:lastRenderedPageBreak/>
         <w:t>The system shall allow visitors and registered users to view published blog posts.</w:t>
       </w:r>
     </w:p>
@@ -8722,6 +9264,7 @@
           <w:szCs w:val="24"/>
           <w:lang w:val="en-IN" w:eastAsia="en-IN" w:bidi="hi-IN"/>
         </w:rPr>
+        <w:lastRenderedPageBreak/>
         <w:t>Database Design Verification</w:t>
       </w:r>
     </w:p>
@@ -8774,9 +9317,21 @@
         <w:t>Table 1: Users</w:t>
       </w:r>
     </w:p>
+    <w:p>
+      <w:pPr>
+        <w:spacing w:before="100" w:beforeAutospacing="1" w:after="100" w:afterAutospacing="1"/>
+        <w:contextualSpacing/>
+        <w:outlineLvl w:val="1"/>
+        <w:rPr>
+          <w:bCs/>
+          <w:sz w:val="24"/>
+          <w:szCs w:val="24"/>
+        </w:rPr>
+      </w:pPr>
+    </w:p>
     <w:tbl>
       <w:tblPr>
-        <w:tblpPr w:leftFromText="180" w:rightFromText="180" w:vertAnchor="page" w:horzAnchor="margin" w:tblpXSpec="center" w:tblpY="2041"/>
+        <w:tblpPr w:leftFromText="180" w:rightFromText="180" w:vertAnchor="page" w:horzAnchor="margin" w:tblpXSpec="center" w:tblpY="1561"/>
         <w:tblW w:w="8537" w:type="dxa"/>
         <w:tblCellSpacing w:w="15" w:type="dxa"/>
         <w:tblCellMar>
@@ -8945,6 +9500,7 @@
                 <w:lang w:val="en-IN" w:eastAsia="en-IN" w:bidi="hi-IN"/>
               </w:rPr>
             </w:pPr>
+            <w:proofErr w:type="spellStart"/>
             <w:r>
               <w:rPr>
                 <w:sz w:val="24"/>
@@ -8953,6 +9509,7 @@
               </w:rPr>
               <w:t>ObjectId</w:t>
             </w:r>
+            <w:proofErr w:type="spellEnd"/>
           </w:p>
         </w:tc>
         <w:tc>
@@ -9269,6 +9826,7 @@
                 <w:lang w:val="en-IN" w:eastAsia="en-IN" w:bidi="hi-IN"/>
               </w:rPr>
             </w:pPr>
+            <w:proofErr w:type="spellStart"/>
             <w:r>
               <w:rPr>
                 <w:rFonts w:ascii="Courier New" w:hAnsi="Courier New" w:cs="Courier New"/>
@@ -9278,6 +9836,7 @@
               </w:rPr>
               <w:t>reset_password_token</w:t>
             </w:r>
+            <w:proofErr w:type="spellEnd"/>
           </w:p>
         </w:tc>
         <w:tc>
@@ -9357,6 +9916,7 @@
                 <w:lang w:val="en-IN" w:eastAsia="en-IN" w:bidi="hi-IN"/>
               </w:rPr>
             </w:pPr>
+            <w:proofErr w:type="spellStart"/>
             <w:r>
               <w:rPr>
                 <w:rFonts w:ascii="Courier New" w:hAnsi="Courier New" w:cs="Courier New"/>
@@ -9366,6 +9926,7 @@
               </w:rPr>
               <w:t>reset_password_expires</w:t>
             </w:r>
+            <w:proofErr w:type="spellEnd"/>
           </w:p>
         </w:tc>
         <w:tc>
@@ -9445,6 +10006,7 @@
                 <w:lang w:val="en-IN" w:eastAsia="en-IN" w:bidi="hi-IN"/>
               </w:rPr>
             </w:pPr>
+            <w:proofErr w:type="spellStart"/>
             <w:r>
               <w:rPr>
                 <w:rFonts w:ascii="Courier New" w:hAnsi="Courier New" w:cs="Courier New"/>
@@ -9454,6 +10016,7 @@
               </w:rPr>
               <w:t>created_at</w:t>
             </w:r>
+            <w:proofErr w:type="spellEnd"/>
           </w:p>
         </w:tc>
         <w:tc>
@@ -9512,18 +10075,6 @@
         </w:tc>
       </w:tr>
     </w:tbl>
-    <w:p>
-      <w:pPr>
-        <w:spacing w:before="100" w:beforeAutospacing="1" w:after="100" w:afterAutospacing="1"/>
-        <w:contextualSpacing/>
-        <w:outlineLvl w:val="1"/>
-        <w:rPr>
-          <w:bCs/>
-          <w:sz w:val="24"/>
-          <w:szCs w:val="24"/>
-        </w:rPr>
-      </w:pPr>
-    </w:p>
     <w:p>
       <w:pPr>
         <w:rPr>
@@ -9872,6 +10423,7 @@
                 <w:lang w:val="en-IN" w:eastAsia="en-IN" w:bidi="hi-IN"/>
               </w:rPr>
             </w:pPr>
+            <w:proofErr w:type="spellStart"/>
             <w:r>
               <w:rPr>
                 <w:sz w:val="24"/>
@@ -9880,6 +10432,7 @@
               </w:rPr>
               <w:t>ObjectId</w:t>
             </w:r>
+            <w:proofErr w:type="spellEnd"/>
           </w:p>
         </w:tc>
         <w:tc>
@@ -10108,6 +10661,7 @@
                 <w:lang w:val="en-IN" w:eastAsia="en-IN" w:bidi="hi-IN"/>
               </w:rPr>
             </w:pPr>
+            <w:proofErr w:type="spellStart"/>
             <w:r>
               <w:rPr>
                 <w:rFonts w:ascii="Courier New" w:hAnsi="Courier New" w:cs="Courier New"/>
@@ -10117,6 +10671,7 @@
               </w:rPr>
               <w:t>author_id</w:t>
             </w:r>
+            <w:proofErr w:type="spellEnd"/>
           </w:p>
         </w:tc>
         <w:tc>
@@ -10136,6 +10691,7 @@
                 <w:lang w:val="en-IN" w:eastAsia="en-IN" w:bidi="hi-IN"/>
               </w:rPr>
             </w:pPr>
+            <w:proofErr w:type="spellStart"/>
             <w:r>
               <w:rPr>
                 <w:sz w:val="24"/>
@@ -10144,6 +10700,7 @@
               </w:rPr>
               <w:t>ObjectId</w:t>
             </w:r>
+            <w:proofErr w:type="spellEnd"/>
           </w:p>
         </w:tc>
         <w:tc>
@@ -10372,6 +10929,7 @@
                 <w:lang w:val="en-IN" w:eastAsia="en-IN" w:bidi="hi-IN"/>
               </w:rPr>
             </w:pPr>
+            <w:proofErr w:type="spellStart"/>
             <w:r>
               <w:rPr>
                 <w:rFonts w:ascii="Courier New" w:hAnsi="Courier New" w:cs="Courier New"/>
@@ -10381,6 +10939,7 @@
               </w:rPr>
               <w:t>created_at</w:t>
             </w:r>
+            <w:proofErr w:type="spellEnd"/>
           </w:p>
         </w:tc>
         <w:tc>
@@ -10460,6 +11019,7 @@
                 <w:lang w:val="en-IN" w:eastAsia="en-IN" w:bidi="hi-IN"/>
               </w:rPr>
             </w:pPr>
+            <w:proofErr w:type="spellStart"/>
             <w:r>
               <w:rPr>
                 <w:rFonts w:ascii="Courier New" w:hAnsi="Courier New" w:cs="Courier New"/>
@@ -10469,6 +11029,7 @@
               </w:rPr>
               <w:t>updated_at</w:t>
             </w:r>
+            <w:proofErr w:type="spellEnd"/>
           </w:p>
         </w:tc>
         <w:tc>
@@ -10928,6 +11489,7 @@
                 <w:lang w:val="en-IN" w:eastAsia="en-IN" w:bidi="hi-IN"/>
               </w:rPr>
             </w:pPr>
+            <w:proofErr w:type="spellStart"/>
             <w:r>
               <w:rPr>
                 <w:sz w:val="24"/>
@@ -10936,6 +11498,7 @@
               </w:rPr>
               <w:t>ObjectId</w:t>
             </w:r>
+            <w:proofErr w:type="spellEnd"/>
           </w:p>
         </w:tc>
         <w:tc>
@@ -11076,6 +11639,7 @@
                 <w:lang w:val="en-IN" w:eastAsia="en-IN" w:bidi="hi-IN"/>
               </w:rPr>
             </w:pPr>
+            <w:proofErr w:type="spellStart"/>
             <w:r>
               <w:rPr>
                 <w:rFonts w:ascii="Courier New" w:hAnsi="Courier New" w:cs="Courier New"/>
@@ -11085,6 +11649,7 @@
               </w:rPr>
               <w:t>post_id</w:t>
             </w:r>
+            <w:proofErr w:type="spellEnd"/>
           </w:p>
         </w:tc>
         <w:tc>
@@ -11104,6 +11669,7 @@
                 <w:lang w:val="en-IN" w:eastAsia="en-IN" w:bidi="hi-IN"/>
               </w:rPr>
             </w:pPr>
+            <w:proofErr w:type="spellStart"/>
             <w:r>
               <w:rPr>
                 <w:sz w:val="24"/>
@@ -11112,6 +11678,7 @@
               </w:rPr>
               <w:t>ObjectId</w:t>
             </w:r>
+            <w:proofErr w:type="spellEnd"/>
           </w:p>
         </w:tc>
         <w:tc>
@@ -11164,6 +11731,7 @@
                 <w:lang w:val="en-IN" w:eastAsia="en-IN" w:bidi="hi-IN"/>
               </w:rPr>
             </w:pPr>
+            <w:proofErr w:type="spellStart"/>
             <w:r>
               <w:rPr>
                 <w:rFonts w:ascii="Courier New" w:hAnsi="Courier New" w:cs="Courier New"/>
@@ -11173,6 +11741,7 @@
               </w:rPr>
               <w:t>author_id</w:t>
             </w:r>
+            <w:proofErr w:type="spellEnd"/>
           </w:p>
         </w:tc>
         <w:tc>
@@ -11192,6 +11761,7 @@
                 <w:lang w:val="en-IN" w:eastAsia="en-IN" w:bidi="hi-IN"/>
               </w:rPr>
             </w:pPr>
+            <w:proofErr w:type="spellStart"/>
             <w:r>
               <w:rPr>
                 <w:sz w:val="24"/>
@@ -11200,6 +11770,7 @@
               </w:rPr>
               <w:t>ObjectId</w:t>
             </w:r>
+            <w:proofErr w:type="spellEnd"/>
           </w:p>
         </w:tc>
         <w:tc>
@@ -11252,6 +11823,7 @@
                 <w:lang w:val="en-IN" w:eastAsia="en-IN" w:bidi="hi-IN"/>
               </w:rPr>
             </w:pPr>
+            <w:proofErr w:type="spellStart"/>
             <w:r>
               <w:rPr>
                 <w:rFonts w:ascii="Courier New" w:hAnsi="Courier New" w:cs="Courier New"/>
@@ -11261,6 +11833,7 @@
               </w:rPr>
               <w:t>parent_id</w:t>
             </w:r>
+            <w:proofErr w:type="spellEnd"/>
           </w:p>
         </w:tc>
         <w:tc>
@@ -11280,6 +11853,7 @@
                 <w:lang w:val="en-IN" w:eastAsia="en-IN" w:bidi="hi-IN"/>
               </w:rPr>
             </w:pPr>
+            <w:proofErr w:type="spellStart"/>
             <w:r>
               <w:rPr>
                 <w:sz w:val="24"/>
@@ -11288,6 +11862,7 @@
               </w:rPr>
               <w:t>ObjectId</w:t>
             </w:r>
+            <w:proofErr w:type="spellEnd"/>
           </w:p>
         </w:tc>
         <w:tc>
@@ -11340,6 +11915,7 @@
                 <w:lang w:val="en-IN" w:eastAsia="en-IN" w:bidi="hi-IN"/>
               </w:rPr>
             </w:pPr>
+            <w:proofErr w:type="spellStart"/>
             <w:r>
               <w:rPr>
                 <w:rFonts w:ascii="Courier New" w:hAnsi="Courier New" w:cs="Courier New"/>
@@ -11349,6 +11925,7 @@
               </w:rPr>
               <w:t>created_at</w:t>
             </w:r>
+            <w:proofErr w:type="spellEnd"/>
           </w:p>
         </w:tc>
         <w:tc>
@@ -11428,6 +12005,7 @@
                 <w:lang w:val="en-IN" w:eastAsia="en-IN" w:bidi="hi-IN"/>
               </w:rPr>
             </w:pPr>
+            <w:proofErr w:type="spellStart"/>
             <w:r>
               <w:rPr>
                 <w:rFonts w:ascii="Courier New" w:hAnsi="Courier New" w:cs="Courier New"/>
@@ -11437,6 +12015,7 @@
               </w:rPr>
               <w:t>updated_at</w:t>
             </w:r>
+            <w:proofErr w:type="spellEnd"/>
           </w:p>
         </w:tc>
         <w:tc>
@@ -11838,8 +12417,17 @@
           <w:sz w:val="24"/>
           <w:szCs w:val="24"/>
         </w:rPr>
-        <w:t>Table 4: Post_Likes</w:t>
-      </w:r>
+        <w:t xml:space="preserve">Table 4: </w:t>
+      </w:r>
+      <w:proofErr w:type="spellStart"/>
+      <w:r>
+        <w:rPr>
+          <w:sz w:val="24"/>
+          <w:szCs w:val="24"/>
+        </w:rPr>
+        <w:t>Post_Likes</w:t>
+      </w:r>
+      <w:proofErr w:type="spellEnd"/>
       <w:r>
         <w:rPr>
           <w:sz w:val="24"/>
@@ -12019,6 +12607,7 @@
                 <w:lang w:val="en-IN" w:eastAsia="en-IN" w:bidi="hi-IN"/>
               </w:rPr>
             </w:pPr>
+            <w:proofErr w:type="spellStart"/>
             <w:r>
               <w:rPr>
                 <w:sz w:val="24"/>
@@ -12027,6 +12616,7 @@
               </w:rPr>
               <w:t>ObjectId</w:t>
             </w:r>
+            <w:proofErr w:type="spellEnd"/>
           </w:p>
         </w:tc>
         <w:tc>
@@ -12079,6 +12669,7 @@
                 <w:lang w:val="en-IN" w:eastAsia="en-IN" w:bidi="hi-IN"/>
               </w:rPr>
             </w:pPr>
+            <w:proofErr w:type="spellStart"/>
             <w:r>
               <w:rPr>
                 <w:rFonts w:ascii="Courier New" w:hAnsi="Courier New" w:cs="Courier New"/>
@@ -12088,6 +12679,7 @@
               </w:rPr>
               <w:t>post_id</w:t>
             </w:r>
+            <w:proofErr w:type="spellEnd"/>
           </w:p>
         </w:tc>
         <w:tc>
@@ -12107,6 +12699,7 @@
                 <w:lang w:val="en-IN" w:eastAsia="en-IN" w:bidi="hi-IN"/>
               </w:rPr>
             </w:pPr>
+            <w:proofErr w:type="spellStart"/>
             <w:r>
               <w:rPr>
                 <w:sz w:val="24"/>
@@ -12115,6 +12708,7 @@
               </w:rPr>
               <w:t>ObjectId</w:t>
             </w:r>
+            <w:proofErr w:type="spellEnd"/>
           </w:p>
         </w:tc>
         <w:tc>
@@ -12167,6 +12761,7 @@
                 <w:lang w:val="en-IN" w:eastAsia="en-IN" w:bidi="hi-IN"/>
               </w:rPr>
             </w:pPr>
+            <w:proofErr w:type="spellStart"/>
             <w:r>
               <w:rPr>
                 <w:rFonts w:ascii="Courier New" w:hAnsi="Courier New" w:cs="Courier New"/>
@@ -12176,6 +12771,7 @@
               </w:rPr>
               <w:t>user_id</w:t>
             </w:r>
+            <w:proofErr w:type="spellEnd"/>
           </w:p>
         </w:tc>
         <w:tc>
@@ -12195,6 +12791,7 @@
                 <w:lang w:val="en-IN" w:eastAsia="en-IN" w:bidi="hi-IN"/>
               </w:rPr>
             </w:pPr>
+            <w:proofErr w:type="spellStart"/>
             <w:r>
               <w:rPr>
                 <w:sz w:val="24"/>
@@ -12203,6 +12800,7 @@
               </w:rPr>
               <w:t>ObjectId</w:t>
             </w:r>
+            <w:proofErr w:type="spellEnd"/>
           </w:p>
         </w:tc>
         <w:tc>
@@ -12255,6 +12853,7 @@
                 <w:lang w:val="en-IN" w:eastAsia="en-IN" w:bidi="hi-IN"/>
               </w:rPr>
             </w:pPr>
+            <w:proofErr w:type="spellStart"/>
             <w:r>
               <w:rPr>
                 <w:rFonts w:ascii="Courier New" w:hAnsi="Courier New" w:cs="Courier New"/>
@@ -12264,6 +12863,7 @@
               </w:rPr>
               <w:t>created_at</w:t>
             </w:r>
+            <w:proofErr w:type="spellEnd"/>
           </w:p>
         </w:tc>
         <w:tc>
@@ -13035,6 +13635,7 @@
           <w:sz w:val="24"/>
           <w:szCs w:val="24"/>
         </w:rPr>
+        <w:lastRenderedPageBreak/>
         <w:t>ERD Diagram</w:t>
       </w:r>
     </w:p>
@@ -13096,8 +13697,8 @@
             <v:path o:extrusionok="f" gradientshapeok="t" o:connecttype="rect"/>
             <o:lock v:ext="edit" aspectratio="t"/>
           </v:shapetype>
-          <v:shape id="_x0000_i1026" type="#_x0000_t75" style="width:450.85pt;height:582.85pt">
-            <v:imagedata r:id="rId11" o:title="ERD"/>
+          <v:shape id="_x0000_i1025" type="#_x0000_t75" style="width:450.75pt;height:582.75pt">
+            <v:imagedata r:id="rId12" o:title="ERD"/>
           </v:shape>
         </w:pict>
       </w:r>
@@ -13361,7 +13962,7 @@
                     </pic:cNvPicPr>
                   </pic:nvPicPr>
                   <pic:blipFill>
-                    <a:blip r:embed="rId12">
+                    <a:blip r:embed="rId13">
                       <a:extLst>
                         <a:ext uri="{28A0092B-C50C-407E-A947-70E740481C1C}">
                           <a14:useLocalDpi xmlns:a14="http://schemas.microsoft.com/office/drawing/2010/main" val="0"/>
@@ -13947,7 +14548,6 @@
           <w:sz w:val="24"/>
           <w:szCs w:val="24"/>
         </w:rPr>
-        <w:lastRenderedPageBreak/>
         <w:tab/>
       </w:r>
     </w:p>
@@ -14026,7 +14626,7 @@
                     </pic:cNvPicPr>
                   </pic:nvPicPr>
                   <pic:blipFill>
-                    <a:blip r:embed="rId13">
+                    <a:blip r:embed="rId14">
                       <a:extLst>
                         <a:ext uri="{28A0092B-C50C-407E-A947-70E740481C1C}">
                           <a14:useLocalDpi xmlns:a14="http://schemas.microsoft.com/office/drawing/2010/main" val="0"/>
@@ -14594,7 +15194,7 @@
                     </pic:cNvPicPr>
                   </pic:nvPicPr>
                   <pic:blipFill>
-                    <a:blip r:embed="rId14">
+                    <a:blip r:embed="rId15">
                       <a:extLst>
                         <a:ext uri="{28A0092B-C50C-407E-A947-70E740481C1C}">
                           <a14:useLocalDpi xmlns:a14="http://schemas.microsoft.com/office/drawing/2010/main" val="0"/>
@@ -15035,7 +15635,7 @@
                     </pic:cNvPicPr>
                   </pic:nvPicPr>
                   <pic:blipFill>
-                    <a:blip r:embed="rId15" cstate="print">
+                    <a:blip r:embed="rId16" cstate="print">
                       <a:extLst>
                         <a:ext uri="{28A0092B-C50C-407E-A947-70E740481C1C}">
                           <a14:useLocalDpi xmlns:a14="http://schemas.microsoft.com/office/drawing/2010/main" val="0"/>
@@ -15184,7 +15784,7 @@
                     </pic:cNvPicPr>
                   </pic:nvPicPr>
                   <pic:blipFill>
-                    <a:blip r:embed="rId16">
+                    <a:blip r:embed="rId17">
                       <a:extLst>
                         <a:ext uri="{28A0092B-C50C-407E-A947-70E740481C1C}">
                           <a14:useLocalDpi xmlns:a14="http://schemas.microsoft.com/office/drawing/2010/main" val="0"/>
@@ -15342,7 +15942,7 @@
                     </pic:cNvPicPr>
                   </pic:nvPicPr>
                   <pic:blipFill>
-                    <a:blip r:embed="rId17">
+                    <a:blip r:embed="rId18">
                       <a:extLst>
                         <a:ext uri="{28A0092B-C50C-407E-A947-70E740481C1C}">
                           <a14:useLocalDpi xmlns:a14="http://schemas.microsoft.com/office/drawing/2010/main" val="0"/>
@@ -15498,6 +16098,10 @@
     <w:p/>
     <w:p>
       <w:r>
+        <w:rPr>
+          <w:noProof/>
+          <w:lang w:val="en-IN" w:eastAsia="en-IN" w:bidi="hi-IN"/>
+        </w:rPr>
         <w:drawing>
           <wp:anchor distT="0" distB="0" distL="114300" distR="114300" simplePos="0" relativeHeight="487599616" behindDoc="1" locked="0" layoutInCell="1" allowOverlap="1" wp14:anchorId="1ED287B7" wp14:editId="65897A5C">
             <wp:simplePos x="0" y="0"/>
@@ -15530,7 +16134,7 @@
                     <pic:cNvPicPr/>
                   </pic:nvPicPr>
                   <pic:blipFill>
-                    <a:blip r:embed="rId18" cstate="print">
+                    <a:blip r:embed="rId19" cstate="print">
                       <a:extLst>
                         <a:ext uri="{28A0092B-C50C-407E-A947-70E740481C1C}">
                           <a14:useLocalDpi xmlns:a14="http://schemas.microsoft.com/office/drawing/2010/main" val="0"/>
@@ -15580,6 +16184,10 @@
     <w:p/>
     <w:p>
       <w:r>
+        <w:rPr>
+          <w:noProof/>
+          <w:lang w:val="en-IN" w:eastAsia="en-IN" w:bidi="hi-IN"/>
+        </w:rPr>
         <w:drawing>
           <wp:anchor distT="0" distB="0" distL="114300" distR="114300" simplePos="0" relativeHeight="487600640" behindDoc="1" locked="0" layoutInCell="1" allowOverlap="1" wp14:anchorId="43CF5E7D" wp14:editId="213A4D3B">
             <wp:simplePos x="0" y="0"/>
@@ -15604,7 +16212,7 @@
                     <pic:cNvPicPr/>
                   </pic:nvPicPr>
                   <pic:blipFill>
-                    <a:blip r:embed="rId19" cstate="print">
+                    <a:blip r:embed="rId20" cstate="print">
                       <a:extLst>
                         <a:ext uri="{28A0092B-C50C-407E-A947-70E740481C1C}">
                           <a14:useLocalDpi xmlns:a14="http://schemas.microsoft.com/office/drawing/2010/main" val="0"/>
@@ -15776,6 +16384,10 @@
         </w:tabs>
       </w:pPr>
       <w:r>
+        <w:rPr>
+          <w:noProof/>
+          <w:lang w:val="en-IN" w:eastAsia="en-IN" w:bidi="hi-IN"/>
+        </w:rPr>
         <w:lastRenderedPageBreak/>
         <w:drawing>
           <wp:anchor distT="0" distB="0" distL="114300" distR="114300" simplePos="0" relativeHeight="487601664" behindDoc="1" locked="0" layoutInCell="1" allowOverlap="1" wp14:anchorId="1BC00769" wp14:editId="4CBDBB4A">
@@ -15809,7 +16421,7 @@
                     <pic:cNvPicPr/>
                   </pic:nvPicPr>
                   <pic:blipFill>
-                    <a:blip r:embed="rId20" cstate="print">
+                    <a:blip r:embed="rId21" cstate="print">
                       <a:extLst>
                         <a:ext uri="{28A0092B-C50C-407E-A947-70E740481C1C}">
                           <a14:useLocalDpi xmlns:a14="http://schemas.microsoft.com/office/drawing/2010/main" val="0"/>
@@ -15988,261 +16600,24 @@
           <w:tab w:val="left" w:pos="4400"/>
         </w:tabs>
       </w:pPr>
-    </w:p>
-    <w:p>
-      <w:pPr>
-        <w:tabs>
-          <w:tab w:val="left" w:pos="4400"/>
-        </w:tabs>
-      </w:pPr>
-    </w:p>
-    <w:p>
-      <w:pPr>
-        <w:tabs>
-          <w:tab w:val="left" w:pos="4400"/>
-        </w:tabs>
-      </w:pPr>
-    </w:p>
-    <w:p>
-      <w:pPr>
-        <w:tabs>
-          <w:tab w:val="left" w:pos="4400"/>
-        </w:tabs>
-      </w:pPr>
-    </w:p>
-    <w:p>
-      <w:pPr>
-        <w:tabs>
-          <w:tab w:val="left" w:pos="4400"/>
-        </w:tabs>
-      </w:pPr>
-      <w:r>
+      <w:r>
+        <w:rPr>
+          <w:noProof/>
+          <w:lang w:val="en-IN" w:eastAsia="en-IN" w:bidi="hi-IN"/>
+        </w:rPr>
         <w:drawing>
-          <wp:anchor distT="0" distB="0" distL="114300" distR="114300" simplePos="0" relativeHeight="487602688" behindDoc="1" locked="0" layoutInCell="1" allowOverlap="1" wp14:anchorId="190A27C8" wp14:editId="471667C8">
+          <wp:anchor distT="0" distB="0" distL="114300" distR="114300" simplePos="0" relativeHeight="487602688" behindDoc="1" locked="0" layoutInCell="1" allowOverlap="1" wp14:anchorId="190A27C8" wp14:editId="6001C8C0">
             <wp:simplePos x="0" y="0"/>
             <wp:positionH relativeFrom="column">
-              <wp:posOffset>533804</wp:posOffset>
+              <wp:posOffset>447675</wp:posOffset>
             </wp:positionH>
             <wp:positionV relativeFrom="paragraph">
-              <wp:posOffset>163714</wp:posOffset>
+              <wp:posOffset>62230</wp:posOffset>
             </wp:positionV>
             <wp:extent cx="6082030" cy="3009579"/>
             <wp:effectExtent l="0" t="0" r="0" b="635"/>
             <wp:wrapNone/>
             <wp:docPr id="19" name="Picture 19"/>
-            <wp:cNvGraphicFramePr>
-              <a:graphicFrameLocks xmlns:a="http://schemas.openxmlformats.org/drawingml/2006/main" noChangeAspect="1"/>
-            </wp:cNvGraphicFramePr>
-            <a:graphic xmlns:a="http://schemas.openxmlformats.org/drawingml/2006/main">
-              <a:graphicData uri="http://schemas.openxmlformats.org/drawingml/2006/picture">
-                <pic:pic xmlns:pic="http://schemas.openxmlformats.org/drawingml/2006/picture">
-                  <pic:nvPicPr>
-                    <pic:cNvPr id="1" name=""/>
-                    <pic:cNvPicPr/>
-                  </pic:nvPicPr>
-                  <pic:blipFill>
-                    <a:blip r:embed="rId21" cstate="print">
-                      <a:extLst>
-                        <a:ext uri="{28A0092B-C50C-407E-A947-70E740481C1C}">
-                          <a14:useLocalDpi xmlns:a14="http://schemas.microsoft.com/office/drawing/2010/main" val="0"/>
-                        </a:ext>
-                      </a:extLst>
-                    </a:blip>
-                    <a:stretch>
-                      <a:fillRect/>
-                    </a:stretch>
-                  </pic:blipFill>
-                  <pic:spPr>
-                    <a:xfrm>
-                      <a:off x="0" y="0"/>
-                      <a:ext cx="6091537" cy="3014283"/>
-                    </a:xfrm>
-                    <a:prstGeom prst="rect">
-                      <a:avLst/>
-                    </a:prstGeom>
-                  </pic:spPr>
-                </pic:pic>
-              </a:graphicData>
-            </a:graphic>
-            <wp14:sizeRelH relativeFrom="margin">
-              <wp14:pctWidth>0</wp14:pctWidth>
-            </wp14:sizeRelH>
-            <wp14:sizeRelV relativeFrom="margin">
-              <wp14:pctHeight>0</wp14:pctHeight>
-            </wp14:sizeRelV>
-          </wp:anchor>
-        </w:drawing>
-      </w:r>
-    </w:p>
-    <w:p>
-      <w:pPr>
-        <w:tabs>
-          <w:tab w:val="left" w:pos="4400"/>
-        </w:tabs>
-      </w:pPr>
-    </w:p>
-    <w:p>
-      <w:pPr>
-        <w:tabs>
-          <w:tab w:val="left" w:pos="4400"/>
-        </w:tabs>
-      </w:pPr>
-    </w:p>
-    <w:p>
-      <w:pPr>
-        <w:tabs>
-          <w:tab w:val="left" w:pos="4400"/>
-        </w:tabs>
-      </w:pPr>
-    </w:p>
-    <w:p>
-      <w:pPr>
-        <w:tabs>
-          <w:tab w:val="left" w:pos="4400"/>
-        </w:tabs>
-      </w:pPr>
-    </w:p>
-    <w:p>
-      <w:pPr>
-        <w:tabs>
-          <w:tab w:val="left" w:pos="4400"/>
-        </w:tabs>
-      </w:pPr>
-    </w:p>
-    <w:p>
-      <w:pPr>
-        <w:tabs>
-          <w:tab w:val="left" w:pos="4400"/>
-        </w:tabs>
-      </w:pPr>
-    </w:p>
-    <w:p>
-      <w:pPr>
-        <w:tabs>
-          <w:tab w:val="left" w:pos="4400"/>
-        </w:tabs>
-      </w:pPr>
-    </w:p>
-    <w:p>
-      <w:pPr>
-        <w:tabs>
-          <w:tab w:val="left" w:pos="4400"/>
-        </w:tabs>
-      </w:pPr>
-    </w:p>
-    <w:p>
-      <w:pPr>
-        <w:tabs>
-          <w:tab w:val="left" w:pos="4400"/>
-        </w:tabs>
-      </w:pPr>
-    </w:p>
-    <w:p>
-      <w:pPr>
-        <w:tabs>
-          <w:tab w:val="left" w:pos="4400"/>
-        </w:tabs>
-      </w:pPr>
-    </w:p>
-    <w:p>
-      <w:pPr>
-        <w:tabs>
-          <w:tab w:val="left" w:pos="4400"/>
-        </w:tabs>
-      </w:pPr>
-    </w:p>
-    <w:p>
-      <w:pPr>
-        <w:tabs>
-          <w:tab w:val="left" w:pos="4400"/>
-        </w:tabs>
-      </w:pPr>
-    </w:p>
-    <w:p>
-      <w:pPr>
-        <w:tabs>
-          <w:tab w:val="left" w:pos="4400"/>
-        </w:tabs>
-      </w:pPr>
-    </w:p>
-    <w:p>
-      <w:pPr>
-        <w:tabs>
-          <w:tab w:val="left" w:pos="4400"/>
-        </w:tabs>
-      </w:pPr>
-    </w:p>
-    <w:p>
-      <w:pPr>
-        <w:tabs>
-          <w:tab w:val="left" w:pos="4400"/>
-        </w:tabs>
-      </w:pPr>
-    </w:p>
-    <w:p>
-      <w:pPr>
-        <w:tabs>
-          <w:tab w:val="left" w:pos="4400"/>
-        </w:tabs>
-      </w:pPr>
-    </w:p>
-    <w:p>
-      <w:pPr>
-        <w:tabs>
-          <w:tab w:val="left" w:pos="4400"/>
-        </w:tabs>
-      </w:pPr>
-    </w:p>
-    <w:p>
-      <w:pPr>
-        <w:tabs>
-          <w:tab w:val="left" w:pos="4400"/>
-        </w:tabs>
-      </w:pPr>
-    </w:p>
-    <w:p>
-      <w:pPr>
-        <w:tabs>
-          <w:tab w:val="left" w:pos="4400"/>
-        </w:tabs>
-      </w:pPr>
-    </w:p>
-    <w:p>
-      <w:pPr>
-        <w:tabs>
-          <w:tab w:val="left" w:pos="4400"/>
-        </w:tabs>
-      </w:pPr>
-    </w:p>
-    <w:p>
-      <w:pPr>
-        <w:tabs>
-          <w:tab w:val="left" w:pos="4400"/>
-        </w:tabs>
-      </w:pPr>
-      <w:r>
-        <w:lastRenderedPageBreak/>
-        <w:drawing>
-          <wp:anchor distT="0" distB="0" distL="114300" distR="114300" simplePos="0" relativeHeight="487603712" behindDoc="1" locked="0" layoutInCell="1" allowOverlap="1" wp14:anchorId="5A1D37E1" wp14:editId="282ECE69">
-            <wp:simplePos x="0" y="0"/>
-            <wp:positionH relativeFrom="column">
-              <wp:posOffset>1176655</wp:posOffset>
-            </wp:positionH>
-            <wp:positionV relativeFrom="paragraph">
-              <wp:posOffset>114704</wp:posOffset>
-            </wp:positionV>
-            <wp:extent cx="4835236" cy="2364765"/>
-            <wp:effectExtent l="0" t="0" r="3810" b="0"/>
-            <wp:wrapTight wrapText="bothSides">
-              <wp:wrapPolygon edited="0">
-                <wp:start x="0" y="0"/>
-                <wp:lineTo x="0" y="21403"/>
-                <wp:lineTo x="21532" y="21403"/>
-                <wp:lineTo x="21532" y="0"/>
-                <wp:lineTo x="0" y="0"/>
-              </wp:wrapPolygon>
-            </wp:wrapTight>
-            <wp:docPr id="20" name="Picture 20"/>
             <wp:cNvGraphicFramePr>
               <a:graphicFrameLocks xmlns:a="http://schemas.openxmlformats.org/drawingml/2006/main" noChangeAspect="1"/>
             </wp:cNvGraphicFramePr>
@@ -16268,6 +16643,257 @@
                   <pic:spPr>
                     <a:xfrm>
                       <a:off x="0" y="0"/>
+                      <a:ext cx="6082030" cy="3009579"/>
+                    </a:xfrm>
+                    <a:prstGeom prst="rect">
+                      <a:avLst/>
+                    </a:prstGeom>
+                  </pic:spPr>
+                </pic:pic>
+              </a:graphicData>
+            </a:graphic>
+            <wp14:sizeRelH relativeFrom="margin">
+              <wp14:pctWidth>0</wp14:pctWidth>
+            </wp14:sizeRelH>
+            <wp14:sizeRelV relativeFrom="margin">
+              <wp14:pctHeight>0</wp14:pctHeight>
+            </wp14:sizeRelV>
+          </wp:anchor>
+        </w:drawing>
+      </w:r>
+    </w:p>
+    <w:p>
+      <w:pPr>
+        <w:tabs>
+          <w:tab w:val="left" w:pos="4400"/>
+        </w:tabs>
+      </w:pPr>
+    </w:p>
+    <w:p>
+      <w:pPr>
+        <w:tabs>
+          <w:tab w:val="left" w:pos="4400"/>
+        </w:tabs>
+      </w:pPr>
+    </w:p>
+    <w:p>
+      <w:pPr>
+        <w:tabs>
+          <w:tab w:val="left" w:pos="4400"/>
+        </w:tabs>
+      </w:pPr>
+    </w:p>
+    <w:p>
+      <w:pPr>
+        <w:tabs>
+          <w:tab w:val="left" w:pos="4400"/>
+        </w:tabs>
+      </w:pPr>
+    </w:p>
+    <w:p>
+      <w:pPr>
+        <w:tabs>
+          <w:tab w:val="left" w:pos="4400"/>
+        </w:tabs>
+      </w:pPr>
+    </w:p>
+    <w:p>
+      <w:pPr>
+        <w:tabs>
+          <w:tab w:val="left" w:pos="4400"/>
+        </w:tabs>
+      </w:pPr>
+    </w:p>
+    <w:p>
+      <w:pPr>
+        <w:tabs>
+          <w:tab w:val="left" w:pos="4400"/>
+        </w:tabs>
+      </w:pPr>
+    </w:p>
+    <w:p>
+      <w:pPr>
+        <w:tabs>
+          <w:tab w:val="left" w:pos="4400"/>
+        </w:tabs>
+      </w:pPr>
+    </w:p>
+    <w:p>
+      <w:pPr>
+        <w:tabs>
+          <w:tab w:val="left" w:pos="4400"/>
+        </w:tabs>
+      </w:pPr>
+    </w:p>
+    <w:p>
+      <w:pPr>
+        <w:tabs>
+          <w:tab w:val="left" w:pos="4400"/>
+        </w:tabs>
+      </w:pPr>
+    </w:p>
+    <w:p>
+      <w:pPr>
+        <w:tabs>
+          <w:tab w:val="left" w:pos="4400"/>
+        </w:tabs>
+      </w:pPr>
+    </w:p>
+    <w:p>
+      <w:pPr>
+        <w:tabs>
+          <w:tab w:val="left" w:pos="4400"/>
+        </w:tabs>
+      </w:pPr>
+    </w:p>
+    <w:p>
+      <w:pPr>
+        <w:tabs>
+          <w:tab w:val="left" w:pos="4400"/>
+        </w:tabs>
+      </w:pPr>
+    </w:p>
+    <w:p>
+      <w:pPr>
+        <w:tabs>
+          <w:tab w:val="left" w:pos="4400"/>
+        </w:tabs>
+      </w:pPr>
+    </w:p>
+    <w:p>
+      <w:pPr>
+        <w:tabs>
+          <w:tab w:val="left" w:pos="4400"/>
+        </w:tabs>
+      </w:pPr>
+    </w:p>
+    <w:p>
+      <w:pPr>
+        <w:tabs>
+          <w:tab w:val="left" w:pos="4400"/>
+        </w:tabs>
+      </w:pPr>
+    </w:p>
+    <w:p>
+      <w:pPr>
+        <w:tabs>
+          <w:tab w:val="left" w:pos="4400"/>
+        </w:tabs>
+      </w:pPr>
+    </w:p>
+    <w:p>
+      <w:pPr>
+        <w:tabs>
+          <w:tab w:val="left" w:pos="4400"/>
+        </w:tabs>
+      </w:pPr>
+    </w:p>
+    <w:p>
+      <w:pPr>
+        <w:tabs>
+          <w:tab w:val="left" w:pos="4400"/>
+        </w:tabs>
+      </w:pPr>
+    </w:p>
+    <w:p>
+      <w:pPr>
+        <w:tabs>
+          <w:tab w:val="left" w:pos="4400"/>
+        </w:tabs>
+      </w:pPr>
+    </w:p>
+    <w:p>
+      <w:pPr>
+        <w:tabs>
+          <w:tab w:val="left" w:pos="4400"/>
+        </w:tabs>
+      </w:pPr>
+    </w:p>
+    <w:p>
+      <w:pPr>
+        <w:tabs>
+          <w:tab w:val="left" w:pos="4400"/>
+        </w:tabs>
+      </w:pPr>
+    </w:p>
+    <w:p>
+      <w:pPr>
+        <w:tabs>
+          <w:tab w:val="left" w:pos="4400"/>
+        </w:tabs>
+      </w:pPr>
+    </w:p>
+    <w:p>
+      <w:pPr>
+        <w:tabs>
+          <w:tab w:val="left" w:pos="4400"/>
+        </w:tabs>
+      </w:pPr>
+    </w:p>
+    <w:p>
+      <w:pPr>
+        <w:tabs>
+          <w:tab w:val="left" w:pos="4400"/>
+        </w:tabs>
+      </w:pPr>
+    </w:p>
+    <w:p>
+      <w:pPr>
+        <w:tabs>
+          <w:tab w:val="left" w:pos="4400"/>
+        </w:tabs>
+      </w:pPr>
+      <w:r>
+        <w:rPr>
+          <w:noProof/>
+          <w:lang w:val="en-IN" w:eastAsia="en-IN" w:bidi="hi-IN"/>
+        </w:rPr>
+        <w:drawing>
+          <wp:anchor distT="0" distB="0" distL="114300" distR="114300" simplePos="0" relativeHeight="487603712" behindDoc="1" locked="0" layoutInCell="1" allowOverlap="1" wp14:anchorId="5A1D37E1" wp14:editId="44A4E108">
+            <wp:simplePos x="0" y="0"/>
+            <wp:positionH relativeFrom="column">
+              <wp:posOffset>1176655</wp:posOffset>
+            </wp:positionH>
+            <wp:positionV relativeFrom="paragraph">
+              <wp:posOffset>-333375</wp:posOffset>
+            </wp:positionV>
+            <wp:extent cx="4835236" cy="2364765"/>
+            <wp:effectExtent l="0" t="0" r="3810" b="0"/>
+            <wp:wrapTight wrapText="bothSides">
+              <wp:wrapPolygon edited="0">
+                <wp:start x="0" y="0"/>
+                <wp:lineTo x="0" y="21403"/>
+                <wp:lineTo x="21532" y="21403"/>
+                <wp:lineTo x="21532" y="0"/>
+                <wp:lineTo x="0" y="0"/>
+              </wp:wrapPolygon>
+            </wp:wrapTight>
+            <wp:docPr id="20" name="Picture 20"/>
+            <wp:cNvGraphicFramePr>
+              <a:graphicFrameLocks xmlns:a="http://schemas.openxmlformats.org/drawingml/2006/main" noChangeAspect="1"/>
+            </wp:cNvGraphicFramePr>
+            <a:graphic xmlns:a="http://schemas.openxmlformats.org/drawingml/2006/main">
+              <a:graphicData uri="http://schemas.openxmlformats.org/drawingml/2006/picture">
+                <pic:pic xmlns:pic="http://schemas.openxmlformats.org/drawingml/2006/picture">
+                  <pic:nvPicPr>
+                    <pic:cNvPr id="1" name=""/>
+                    <pic:cNvPicPr/>
+                  </pic:nvPicPr>
+                  <pic:blipFill>
+                    <a:blip r:embed="rId23" cstate="print">
+                      <a:extLst>
+                        <a:ext uri="{28A0092B-C50C-407E-A947-70E740481C1C}">
+                          <a14:useLocalDpi xmlns:a14="http://schemas.microsoft.com/office/drawing/2010/main" val="0"/>
+                        </a:ext>
+                      </a:extLst>
+                    </a:blip>
+                    <a:stretch>
+                      <a:fillRect/>
+                    </a:stretch>
+                  </pic:blipFill>
+                  <pic:spPr>
+                    <a:xfrm>
+                      <a:off x="0" y="0"/>
                       <a:ext cx="4835236" cy="2364765"/>
                     </a:xfrm>
                     <a:prstGeom prst="rect">
@@ -16388,13 +17014,6 @@
     </w:p>
     <w:p>
       <w:pPr>
-        <w:tabs>
-          <w:tab w:val="left" w:pos="4400"/>
-        </w:tabs>
-      </w:pPr>
-    </w:p>
-    <w:p>
-      <w:pPr>
         <w:pStyle w:val="ListParagraph"/>
         <w:numPr>
           <w:ilvl w:val="0"/>
@@ -16466,6 +17085,7 @@
         </w:rPr>
         <w:t xml:space="preserve">4.1 </w:t>
       </w:r>
+      <w:proofErr w:type="spellStart"/>
       <w:r>
         <w:rPr>
           <w:b/>
@@ -16475,6 +17095,7 @@
         </w:rPr>
         <w:t>Alogorithm</w:t>
       </w:r>
+      <w:proofErr w:type="spellEnd"/>
     </w:p>
     <w:p>
       <w:pPr>
@@ -16755,7 +17376,6 @@
         <w:rPr>
           <w:rStyle w:val="Strong"/>
         </w:rPr>
-        <w:lastRenderedPageBreak/>
         <w:t>Steps:</w:t>
       </w:r>
     </w:p>
@@ -16900,6 +17520,7 @@
         <w:ind w:left="2160"/>
       </w:pPr>
       <w:r>
+        <w:lastRenderedPageBreak/>
         <w:t>End</w:t>
       </w:r>
     </w:p>
@@ -17262,7 +17883,6 @@
         <w:ind w:left="2160"/>
       </w:pPr>
       <w:r>
-        <w:lastRenderedPageBreak/>
         <w:t>Display confirmation message</w:t>
       </w:r>
     </w:p>
@@ -17354,6 +17974,7 @@
         <w:ind w:left="2160"/>
       </w:pPr>
       <w:r>
+        <w:lastRenderedPageBreak/>
         <w:t>Start</w:t>
       </w:r>
     </w:p>
@@ -17636,6 +18257,42 @@
     </w:p>
     <w:p>
       <w:pPr>
+        <w:pStyle w:val="NormalWeb"/>
+        <w:spacing w:line="360" w:lineRule="auto"/>
+      </w:pPr>
+    </w:p>
+    <w:p>
+      <w:pPr>
+        <w:pStyle w:val="NormalWeb"/>
+        <w:spacing w:line="360" w:lineRule="auto"/>
+      </w:pPr>
+    </w:p>
+    <w:p>
+      <w:pPr>
+        <w:pStyle w:val="NormalWeb"/>
+        <w:spacing w:line="360" w:lineRule="auto"/>
+      </w:pPr>
+    </w:p>
+    <w:p>
+      <w:pPr>
+        <w:pStyle w:val="NormalWeb"/>
+        <w:spacing w:line="360" w:lineRule="auto"/>
+      </w:pPr>
+    </w:p>
+    <w:p>
+      <w:pPr>
+        <w:pStyle w:val="NormalWeb"/>
+        <w:spacing w:line="360" w:lineRule="auto"/>
+      </w:pPr>
+    </w:p>
+    <w:p>
+      <w:pPr>
+        <w:pStyle w:val="NormalWeb"/>
+        <w:spacing w:line="360" w:lineRule="auto"/>
+      </w:pPr>
+    </w:p>
+    <w:p>
+      <w:pPr>
         <w:tabs>
           <w:tab w:val="left" w:pos="4400"/>
         </w:tabs>
@@ -17666,7 +18323,6 @@
           <w:sz w:val="28"/>
           <w:szCs w:val="28"/>
         </w:rPr>
-        <w:lastRenderedPageBreak/>
         <w:t xml:space="preserve">       4.2 Code Snippet</w:t>
       </w:r>
     </w:p>
@@ -17725,7 +18381,7 @@
                     </pic:cNvPicPr>
                   </pic:nvPicPr>
                   <pic:blipFill>
-                    <a:blip r:embed="rId23">
+                    <a:blip r:embed="rId24">
                       <a:extLst>
                         <a:ext uri="{28A0092B-C50C-407E-A947-70E740481C1C}">
                           <a14:useLocalDpi xmlns:a14="http://schemas.microsoft.com/office/drawing/2010/main" val="0"/>
@@ -17858,7 +18514,7 @@
                     </pic:cNvPicPr>
                   </pic:nvPicPr>
                   <pic:blipFill>
-                    <a:blip r:embed="rId24">
+                    <a:blip r:embed="rId25">
                       <a:extLst>
                         <a:ext uri="{28A0092B-C50C-407E-A947-70E740481C1C}">
                           <a14:useLocalDpi xmlns:a14="http://schemas.microsoft.com/office/drawing/2010/main" val="0"/>
@@ -18076,7 +18732,7 @@
                     </pic:cNvPicPr>
                   </pic:nvPicPr>
                   <pic:blipFill>
-                    <a:blip r:embed="rId25" cstate="print">
+                    <a:blip r:embed="rId26" cstate="print">
                       <a:extLst>
                         <a:ext uri="{28A0092B-C50C-407E-A947-70E740481C1C}">
                           <a14:useLocalDpi xmlns:a14="http://schemas.microsoft.com/office/drawing/2010/main" val="0"/>
@@ -18487,6 +19143,84 @@
           <w:szCs w:val="24"/>
         </w:rPr>
       </w:pPr>
+    </w:p>
+    <w:p>
+      <w:pPr>
+        <w:tabs>
+          <w:tab w:val="left" w:pos="4400"/>
+        </w:tabs>
+        <w:rPr>
+          <w:b/>
+          <w:bCs/>
+          <w:sz w:val="24"/>
+          <w:szCs w:val="24"/>
+        </w:rPr>
+      </w:pPr>
+    </w:p>
+    <w:p>
+      <w:pPr>
+        <w:tabs>
+          <w:tab w:val="left" w:pos="4400"/>
+        </w:tabs>
+        <w:rPr>
+          <w:b/>
+          <w:bCs/>
+          <w:sz w:val="24"/>
+          <w:szCs w:val="24"/>
+        </w:rPr>
+      </w:pPr>
+    </w:p>
+    <w:p>
+      <w:pPr>
+        <w:tabs>
+          <w:tab w:val="left" w:pos="4400"/>
+        </w:tabs>
+        <w:rPr>
+          <w:b/>
+          <w:bCs/>
+          <w:sz w:val="24"/>
+          <w:szCs w:val="24"/>
+        </w:rPr>
+      </w:pPr>
+    </w:p>
+    <w:p>
+      <w:pPr>
+        <w:tabs>
+          <w:tab w:val="left" w:pos="4400"/>
+        </w:tabs>
+        <w:rPr>
+          <w:b/>
+          <w:bCs/>
+          <w:sz w:val="24"/>
+          <w:szCs w:val="24"/>
+        </w:rPr>
+      </w:pPr>
+    </w:p>
+    <w:p>
+      <w:pPr>
+        <w:tabs>
+          <w:tab w:val="left" w:pos="4400"/>
+        </w:tabs>
+        <w:rPr>
+          <w:b/>
+          <w:bCs/>
+          <w:sz w:val="24"/>
+          <w:szCs w:val="24"/>
+        </w:rPr>
+      </w:pPr>
+    </w:p>
+    <w:p>
+      <w:pPr>
+        <w:tabs>
+          <w:tab w:val="left" w:pos="4400"/>
+        </w:tabs>
+        <w:rPr>
+          <w:b/>
+          <w:bCs/>
+          <w:sz w:val="24"/>
+          <w:szCs w:val="24"/>
+        </w:rPr>
+      </w:pPr>
       <w:r>
         <w:rPr>
           <w:b/>
@@ -18497,22 +19231,22 @@
           <w:lang w:val="en-IN" w:eastAsia="en-IN" w:bidi="hi-IN"/>
         </w:rPr>
         <w:drawing>
-          <wp:anchor distT="0" distB="0" distL="114300" distR="114300" simplePos="0" relativeHeight="487607808" behindDoc="1" locked="0" layoutInCell="1" allowOverlap="1" wp14:anchorId="31AB7967" wp14:editId="3887E6AD">
+          <wp:anchor distT="0" distB="0" distL="114300" distR="114300" simplePos="0" relativeHeight="487607808" behindDoc="1" locked="0" layoutInCell="1" allowOverlap="1" wp14:anchorId="31AB7967" wp14:editId="01CADE5E">
             <wp:simplePos x="0" y="0"/>
             <wp:positionH relativeFrom="column">
-              <wp:posOffset>875665</wp:posOffset>
+              <wp:posOffset>741680</wp:posOffset>
             </wp:positionH>
             <wp:positionV relativeFrom="paragraph">
-              <wp:posOffset>-117838</wp:posOffset>
+              <wp:posOffset>-1059180</wp:posOffset>
             </wp:positionV>
-            <wp:extent cx="5506720" cy="4262120"/>
-            <wp:effectExtent l="0" t="0" r="0" b="5080"/>
+            <wp:extent cx="5137150" cy="3976370"/>
+            <wp:effectExtent l="0" t="0" r="6350" b="5080"/>
             <wp:wrapTight wrapText="bothSides">
               <wp:wrapPolygon edited="0">
                 <wp:start x="0" y="0"/>
-                <wp:lineTo x="0" y="21529"/>
-                <wp:lineTo x="21520" y="21529"/>
-                <wp:lineTo x="21520" y="0"/>
+                <wp:lineTo x="0" y="21524"/>
+                <wp:lineTo x="21547" y="21524"/>
+                <wp:lineTo x="21547" y="0"/>
                 <wp:lineTo x="0" y="0"/>
               </wp:wrapPolygon>
             </wp:wrapTight>
@@ -18530,7 +19264,7 @@
                     </pic:cNvPicPr>
                   </pic:nvPicPr>
                   <pic:blipFill>
-                    <a:blip r:embed="rId26" cstate="print">
+                    <a:blip r:embed="rId27" cstate="print">
                       <a:extLst>
                         <a:ext uri="{28A0092B-C50C-407E-A947-70E740481C1C}">
                           <a14:useLocalDpi xmlns:a14="http://schemas.microsoft.com/office/drawing/2010/main" val="0"/>
@@ -18545,7 +19279,7 @@
                   <pic:spPr bwMode="auto">
                     <a:xfrm>
                       <a:off x="0" y="0"/>
-                      <a:ext cx="5506720" cy="4262120"/>
+                      <a:ext cx="5137150" cy="3976370"/>
                     </a:xfrm>
                     <a:prstGeom prst="rect">
                       <a:avLst/>
@@ -18567,84 +19301,6 @@
           </wp:anchor>
         </w:drawing>
       </w:r>
-    </w:p>
-    <w:p>
-      <w:pPr>
-        <w:tabs>
-          <w:tab w:val="left" w:pos="4400"/>
-        </w:tabs>
-        <w:rPr>
-          <w:b/>
-          <w:bCs/>
-          <w:sz w:val="24"/>
-          <w:szCs w:val="24"/>
-        </w:rPr>
-      </w:pPr>
-    </w:p>
-    <w:p>
-      <w:pPr>
-        <w:tabs>
-          <w:tab w:val="left" w:pos="4400"/>
-        </w:tabs>
-        <w:rPr>
-          <w:b/>
-          <w:bCs/>
-          <w:sz w:val="24"/>
-          <w:szCs w:val="24"/>
-        </w:rPr>
-      </w:pPr>
-    </w:p>
-    <w:p>
-      <w:pPr>
-        <w:tabs>
-          <w:tab w:val="left" w:pos="4400"/>
-        </w:tabs>
-        <w:rPr>
-          <w:b/>
-          <w:bCs/>
-          <w:sz w:val="24"/>
-          <w:szCs w:val="24"/>
-        </w:rPr>
-      </w:pPr>
-    </w:p>
-    <w:p>
-      <w:pPr>
-        <w:tabs>
-          <w:tab w:val="left" w:pos="4400"/>
-        </w:tabs>
-        <w:rPr>
-          <w:b/>
-          <w:bCs/>
-          <w:sz w:val="24"/>
-          <w:szCs w:val="24"/>
-        </w:rPr>
-      </w:pPr>
-    </w:p>
-    <w:p>
-      <w:pPr>
-        <w:tabs>
-          <w:tab w:val="left" w:pos="4400"/>
-        </w:tabs>
-        <w:rPr>
-          <w:b/>
-          <w:bCs/>
-          <w:sz w:val="24"/>
-          <w:szCs w:val="24"/>
-        </w:rPr>
-      </w:pPr>
-    </w:p>
-    <w:p>
-      <w:pPr>
-        <w:tabs>
-          <w:tab w:val="left" w:pos="4400"/>
-        </w:tabs>
-        <w:rPr>
-          <w:b/>
-          <w:bCs/>
-          <w:sz w:val="24"/>
-          <w:szCs w:val="24"/>
-        </w:rPr>
-      </w:pPr>
     </w:p>
     <w:p>
       <w:pPr>
@@ -20690,34 +21346,6 @@
         <w:tabs>
           <w:tab w:val="left" w:pos="4400"/>
         </w:tabs>
-        <w:ind w:left="360"/>
-        <w:rPr>
-          <w:b/>
-          <w:bCs/>
-          <w:sz w:val="24"/>
-          <w:szCs w:val="24"/>
-        </w:rPr>
-      </w:pPr>
-    </w:p>
-    <w:p>
-      <w:pPr>
-        <w:tabs>
-          <w:tab w:val="left" w:pos="4400"/>
-        </w:tabs>
-        <w:ind w:left="360"/>
-        <w:rPr>
-          <w:b/>
-          <w:bCs/>
-          <w:sz w:val="24"/>
-          <w:szCs w:val="24"/>
-        </w:rPr>
-      </w:pPr>
-    </w:p>
-    <w:p>
-      <w:pPr>
-        <w:tabs>
-          <w:tab w:val="left" w:pos="4400"/>
-        </w:tabs>
         <w:spacing w:line="360" w:lineRule="auto"/>
         <w:ind w:left="360"/>
         <w:rPr>
@@ -20727,6 +21355,8 @@
           <w:szCs w:val="24"/>
         </w:rPr>
       </w:pPr>
+      <w:bookmarkStart w:id="0" w:name="_GoBack"/>
+      <w:bookmarkEnd w:id="0"/>
     </w:p>
     <w:p>
       <w:pPr>
@@ -20822,7 +21452,25 @@
           <w:szCs w:val="24"/>
           <w:lang w:val="en-IN" w:eastAsia="en-IN" w:bidi="hi-IN"/>
         </w:rPr>
-        <w:t xml:space="preserve">Although the Blog Platform with CMS fulfills the essential requirements of a modern blogging application, </w:t>
+        <w:t xml:space="preserve">Although the Blog Platform with CMS </w:t>
+      </w:r>
+      <w:proofErr w:type="spellStart"/>
+      <w:r>
+        <w:rPr>
+          <w:sz w:val="24"/>
+          <w:szCs w:val="24"/>
+          <w:lang w:val="en-IN" w:eastAsia="en-IN" w:bidi="hi-IN"/>
+        </w:rPr>
+        <w:t>fulfills</w:t>
+      </w:r>
+      <w:proofErr w:type="spellEnd"/>
+      <w:r>
+        <w:rPr>
+          <w:sz w:val="24"/>
+          <w:szCs w:val="24"/>
+          <w:lang w:val="en-IN" w:eastAsia="en-IN" w:bidi="hi-IN"/>
+        </w:rPr>
+        <w:t xml:space="preserve"> the essential requirements of a modern blogging application, </w:t>
       </w:r>
       <w:r>
         <w:rPr>
@@ -21407,7 +22055,24 @@
           <w:lang w:val="en-IN" w:eastAsia="en-IN" w:bidi="hi-IN"/>
         </w:rPr>
         <w:br/>
-        <w:t>Caching mechanisms and performance optimization techniques can be applied to improve response time and handle higher traffic loads efficiently.</w:t>
+      </w:r>
+      <w:proofErr w:type="spellStart"/>
+      <w:r>
+        <w:rPr>
+          <w:sz w:val="24"/>
+          <w:szCs w:val="24"/>
+          <w:lang w:val="en-IN" w:eastAsia="en-IN" w:bidi="hi-IN"/>
+        </w:rPr>
+        <w:t>Caching</w:t>
+      </w:r>
+      <w:proofErr w:type="spellEnd"/>
+      <w:r>
+        <w:rPr>
+          <w:sz w:val="24"/>
+          <w:szCs w:val="24"/>
+          <w:lang w:val="en-IN" w:eastAsia="en-IN" w:bidi="hi-IN"/>
+        </w:rPr>
+        <w:t xml:space="preserve"> mechanisms and performance optimization techniques can be applied to improve response time and handle higher traffic loads efficiently.</w:t>
       </w:r>
     </w:p>
     <w:p>
@@ -21735,8 +22400,6 @@
           <w:szCs w:val="24"/>
         </w:rPr>
       </w:pPr>
-      <w:bookmarkStart w:id="0" w:name="_GoBack"/>
-      <w:bookmarkEnd w:id="0"/>
     </w:p>
     <w:p>
       <w:pPr>
@@ -21772,6 +22435,7 @@
         <w:spacing w:line="360" w:lineRule="auto"/>
         <w:ind w:left="720"/>
       </w:pPr>
+      <w:proofErr w:type="gramStart"/>
       <w:r>
         <w:rPr>
           <w:rFonts w:hAnsi="Symbol"/>
@@ -21779,12 +22443,16 @@
         <w:t></w:t>
       </w:r>
       <w:r>
-        <w:t xml:space="preserve">  MongoDB Documentation,</w:t>
+        <w:t xml:space="preserve">  MongoDB</w:t>
+      </w:r>
+      <w:proofErr w:type="gramEnd"/>
+      <w:r>
+        <w:t xml:space="preserve"> Documentation,</w:t>
       </w:r>
       <w:r>
         <w:br/>
       </w:r>
-      <w:hyperlink r:id="rId27" w:history="1">
+      <w:hyperlink r:id="rId28" w:history="1">
         <w:r>
           <w:rPr>
             <w:rStyle w:val="Hyperlink"/>
@@ -21799,6 +22467,7 @@
         <w:spacing w:line="360" w:lineRule="auto"/>
         <w:ind w:left="720"/>
       </w:pPr>
+      <w:proofErr w:type="gramStart"/>
       <w:r>
         <w:rPr>
           <w:rFonts w:hAnsi="Symbol"/>
@@ -21806,12 +22475,16 @@
         <w:t></w:t>
       </w:r>
       <w:r>
-        <w:t xml:space="preserve">  Flask Official Documentation,</w:t>
+        <w:t xml:space="preserve">  Flask</w:t>
+      </w:r>
+      <w:proofErr w:type="gramEnd"/>
+      <w:r>
+        <w:t xml:space="preserve"> Official Documentation,</w:t>
       </w:r>
       <w:r>
         <w:br/>
       </w:r>
-      <w:hyperlink r:id="rId28" w:tgtFrame="_new" w:history="1">
+      <w:hyperlink r:id="rId29" w:tgtFrame="_new" w:history="1">
         <w:r>
           <w:rPr>
             <w:rStyle w:val="Hyperlink"/>
@@ -21826,6 +22499,7 @@
         <w:spacing w:line="360" w:lineRule="auto"/>
         <w:ind w:left="720"/>
       </w:pPr>
+      <w:proofErr w:type="gramStart"/>
       <w:r>
         <w:rPr>
           <w:rFonts w:hAnsi="Symbol"/>
@@ -21833,12 +22507,16 @@
         <w:t></w:t>
       </w:r>
       <w:r>
-        <w:t xml:space="preserve">  Next.js Documentation,</w:t>
+        <w:t xml:space="preserve">  Next.js</w:t>
+      </w:r>
+      <w:proofErr w:type="gramEnd"/>
+      <w:r>
+        <w:t xml:space="preserve"> Documentation,</w:t>
       </w:r>
       <w:r>
         <w:br/>
       </w:r>
-      <w:hyperlink r:id="rId29" w:tgtFrame="_new" w:history="1">
+      <w:hyperlink r:id="rId30" w:tgtFrame="_new" w:history="1">
         <w:r>
           <w:rPr>
             <w:rStyle w:val="Hyperlink"/>
@@ -21853,6 +22531,7 @@
         <w:spacing w:line="360" w:lineRule="auto"/>
         <w:ind w:left="720"/>
       </w:pPr>
+      <w:proofErr w:type="gramStart"/>
       <w:r>
         <w:rPr>
           <w:rFonts w:hAnsi="Symbol"/>
@@ -21860,12 +22539,16 @@
         <w:t></w:t>
       </w:r>
       <w:r>
-        <w:t xml:space="preserve">  React Documentation,</w:t>
+        <w:t xml:space="preserve">  React</w:t>
+      </w:r>
+      <w:proofErr w:type="gramEnd"/>
+      <w:r>
+        <w:t xml:space="preserve"> Documentation,</w:t>
       </w:r>
       <w:r>
         <w:br/>
       </w:r>
-      <w:hyperlink r:id="rId30" w:tgtFrame="_new" w:history="1">
+      <w:hyperlink r:id="rId31" w:tgtFrame="_new" w:history="1">
         <w:r>
           <w:rPr>
             <w:rStyle w:val="Hyperlink"/>
@@ -21880,6 +22563,7 @@
         <w:spacing w:line="360" w:lineRule="auto"/>
         <w:ind w:left="720"/>
       </w:pPr>
+      <w:proofErr w:type="gramStart"/>
       <w:r>
         <w:rPr>
           <w:rFonts w:hAnsi="Symbol"/>
@@ -21887,12 +22571,16 @@
         <w:t></w:t>
       </w:r>
       <w:r>
-        <w:t xml:space="preserve">  Tailwind CSS Documentation,</w:t>
+        <w:t xml:space="preserve">  Tailwind</w:t>
+      </w:r>
+      <w:proofErr w:type="gramEnd"/>
+      <w:r>
+        <w:t xml:space="preserve"> CSS Documentation,</w:t>
       </w:r>
       <w:r>
         <w:br/>
       </w:r>
-      <w:hyperlink r:id="rId31" w:tgtFrame="_new" w:history="1">
+      <w:hyperlink r:id="rId32" w:tgtFrame="_new" w:history="1">
         <w:r>
           <w:rPr>
             <w:rStyle w:val="Hyperlink"/>
@@ -21969,7 +22657,7 @@
           <w:rPr>
             <w:noProof/>
           </w:rPr>
-          <w:t>20</w:t>
+          <w:t>30</w:t>
         </w:r>
         <w:r>
           <w:rPr>
@@ -27069,6 +27757,7 @@
   <w:style w:type="character" w:default="1" w:styleId="DefaultParagraphFont">
     <w:name w:val="Default Paragraph Font"/>
     <w:uiPriority w:val="1"/>
+    <w:semiHidden/>
     <w:unhideWhenUsed/>
   </w:style>
   <w:style w:type="table" w:default="1" w:styleId="TableNormal">
@@ -27548,4 +28237,16 @@
   <a:objectDefaults/>
   <a:extraClrSchemeLst/>
 </a:theme>
+</file>
+
+<file path=customXml/item1.xml><?xml version="1.0" encoding="utf-8"?>
+<b:Sources xmlns:b="http://schemas.openxmlformats.org/officeDocument/2006/bibliography" xmlns="http://schemas.openxmlformats.org/officeDocument/2006/bibliography" SelectedStyle="\APASixthEditionOfficeOnline.xsl" StyleName="APA" Version="6"/>
+</file>
+
+<file path=customXml/itemProps1.xml><?xml version="1.0" encoding="utf-8"?>
+<ds:datastoreItem xmlns:ds="http://schemas.openxmlformats.org/officeDocument/2006/customXml" ds:itemID="{926265BC-2D0A-4251-9D6F-786B56464D7D}">
+  <ds:schemaRefs>
+    <ds:schemaRef ds:uri="http://schemas.openxmlformats.org/officeDocument/2006/bibliography"/>
+  </ds:schemaRefs>
+</ds:datastoreItem>
 </file>
</xml_diff>